<commit_message>
UPDATE: Kalman Filter completed
</commit_message>
<xml_diff>
--- a/navigation/results/Averaging Filter on a Noisy dataset.docx
+++ b/navigation/results/Averaging Filter on a Noisy dataset.docx
@@ -17,7 +17,13 @@
         <w:t>Averaging Filter on a Noisy dataset</w:t>
       </w:r>
     </w:p>
-    <w:p/>
+    <w:p>
+      <w:pPr>
+        <w:rPr>
+          <w:rFonts w:ascii="Times New Roman" w:hAnsi="Times New Roman" w:cs="Times New Roman"/>
+        </w:rPr>
+      </w:pPr>
+    </w:p>
     <w:p>
       <w:pPr>
         <w:rPr>
@@ -124,6 +130,7 @@
           <w:rFonts w:ascii="Times New Roman" w:hAnsi="Times New Roman" w:cs="Times New Roman"/>
           <w:b/>
           <w:bCs/>
+          <w:noProof/>
         </w:rPr>
         <w:drawing>
           <wp:inline distT="0" distB="0" distL="0" distR="0" wp14:anchorId="792617B4" wp14:editId="5488F356">
@@ -186,15 +193,7 @@
             <w:sz w:val="18"/>
             <w:szCs w:val="18"/>
           </w:rPr>
-          <m:t>μ=0 and σ=10</m:t>
-        </m:r>
-        <m:r>
-          <w:rPr>
-            <w:rFonts w:ascii="Cambria Math" w:hAnsi="Cambria Math" w:cs="Times New Roman"/>
-            <w:sz w:val="18"/>
-            <w:szCs w:val="18"/>
-          </w:rPr>
-          <m:t>)</m:t>
+          <m:t>μ=0 and σ=10)</m:t>
         </m:r>
       </m:oMath>
     </w:p>
@@ -256,12 +255,14 @@
       <w:pPr>
         <w:pStyle w:val="Heading3"/>
         <w:rPr>
-          <w:b/>
-          <w:bCs/>
-        </w:rPr>
-      </w:pPr>
-      <w:r>
-        <w:rPr>
+          <w:rFonts w:ascii="Times New Roman" w:hAnsi="Times New Roman" w:cs="Times New Roman"/>
+          <w:b/>
+          <w:bCs/>
+        </w:rPr>
+      </w:pPr>
+      <w:r>
+        <w:rPr>
+          <w:rFonts w:ascii="Times New Roman" w:hAnsi="Times New Roman" w:cs="Times New Roman"/>
           <w:b/>
           <w:bCs/>
         </w:rPr>
@@ -269,7 +270,16 @@
       </w:r>
     </w:p>
     <w:p>
-      <w:r>
+      <w:pPr>
+        <w:rPr>
+          <w:rFonts w:ascii="Times New Roman" w:hAnsi="Times New Roman" w:cs="Times New Roman"/>
+        </w:rPr>
+      </w:pPr>
+      <w:r>
+        <w:rPr>
+          <w:rFonts w:ascii="Times New Roman" w:hAnsi="Times New Roman" w:cs="Times New Roman"/>
+          <w:noProof/>
+        </w:rPr>
         <w:drawing>
           <wp:inline distT="0" distB="0" distL="0" distR="0" wp14:anchorId="25A7A9E7" wp14:editId="6F30A027">
             <wp:extent cx="2743200" cy="3400281"/>
@@ -307,7 +317,13 @@
         </w:drawing>
       </w:r>
     </w:p>
-    <w:p/>
+    <w:p>
+      <w:pPr>
+        <w:rPr>
+          <w:rFonts w:ascii="Times New Roman" w:hAnsi="Times New Roman" w:cs="Times New Roman"/>
+        </w:rPr>
+      </w:pPr>
+    </w:p>
     <w:p>
       <w:pPr>
         <w:pStyle w:val="ListParagraph"/>
@@ -376,6 +392,7 @@
           <w:rFonts w:ascii="Times New Roman" w:hAnsi="Times New Roman" w:cs="Times New Roman"/>
           <w:b/>
           <w:bCs/>
+          <w:noProof/>
           <w:sz w:val="28"/>
           <w:szCs w:val="28"/>
         </w:rPr>
@@ -458,6 +475,7 @@
           <w:rFonts w:ascii="Times New Roman" w:hAnsi="Times New Roman" w:cs="Times New Roman"/>
           <w:b/>
           <w:bCs/>
+          <w:noProof/>
           <w:sz w:val="28"/>
           <w:szCs w:val="28"/>
         </w:rPr>
@@ -540,6 +558,7 @@
           <w:rFonts w:ascii="Times New Roman" w:hAnsi="Times New Roman" w:cs="Times New Roman"/>
           <w:b/>
           <w:bCs/>
+          <w:noProof/>
           <w:sz w:val="28"/>
           <w:szCs w:val="28"/>
         </w:rPr>
@@ -623,6 +642,7 @@
           <w:rFonts w:ascii="Times New Roman" w:hAnsi="Times New Roman" w:cs="Times New Roman"/>
           <w:b/>
           <w:bCs/>
+          <w:noProof/>
           <w:sz w:val="28"/>
           <w:szCs w:val="28"/>
         </w:rPr>
@@ -705,6 +725,7 @@
           <w:rFonts w:ascii="Times New Roman" w:hAnsi="Times New Roman" w:cs="Times New Roman"/>
           <w:b/>
           <w:bCs/>
+          <w:noProof/>
           <w:sz w:val="28"/>
           <w:szCs w:val="28"/>
         </w:rPr>
@@ -923,6 +944,7 @@
           <w:rFonts w:ascii="Times New Roman" w:hAnsi="Times New Roman" w:cs="Times New Roman"/>
           <w:b/>
           <w:bCs/>
+          <w:noProof/>
           <w:sz w:val="28"/>
           <w:szCs w:val="28"/>
         </w:rPr>
@@ -976,6 +998,7 @@
           <w:rFonts w:ascii="Times New Roman" w:hAnsi="Times New Roman" w:cs="Times New Roman"/>
           <w:b/>
           <w:bCs/>
+          <w:noProof/>
         </w:rPr>
         <w:drawing>
           <wp:inline distT="0" distB="0" distL="0" distR="0" wp14:anchorId="2FA8F99B" wp14:editId="22F9195A">
@@ -1027,6 +1050,7 @@
           <w:rFonts w:ascii="Times New Roman" w:hAnsi="Times New Roman" w:cs="Times New Roman"/>
           <w:b/>
           <w:bCs/>
+          <w:noProof/>
         </w:rPr>
         <w:drawing>
           <wp:inline distT="0" distB="0" distL="0" distR="0" wp14:anchorId="427B071E" wp14:editId="777C7200">
@@ -1078,6 +1102,7 @@
           <w:rFonts w:ascii="Times New Roman" w:hAnsi="Times New Roman" w:cs="Times New Roman"/>
           <w:b/>
           <w:bCs/>
+          <w:noProof/>
         </w:rPr>
         <w:drawing>
           <wp:inline distT="0" distB="0" distL="0" distR="0" wp14:anchorId="5FC4BBE4" wp14:editId="406EA776">
@@ -1136,57 +1161,279 @@
         <w:rPr>
           <w:rFonts w:ascii="Times New Roman" w:hAnsi="Times New Roman" w:cs="Times New Roman"/>
         </w:rPr>
-        <w:t>The averaging filter works as expected, the only drawback is that the fixed CSV of 2000 pkt. is restricting to demonstrate the oversampling of values.</w:t>
-      </w:r>
-      <w:r>
-        <w:rPr>
-          <w:rFonts w:ascii="Times New Roman" w:hAnsi="Times New Roman" w:cs="Times New Roman"/>
-        </w:rPr>
-        <w:t xml:space="preserve"> </w:t>
-      </w:r>
-      <w:r>
-        <w:rPr>
-          <w:rFonts w:ascii="Times New Roman" w:hAnsi="Times New Roman" w:cs="Times New Roman"/>
-          <w:b/>
-          <w:bCs/>
-        </w:rPr>
-        <w:t>Oversampling is a method of smoothening (removing noise/spikes) from the sensor readings to get much more accurate values over a period of time. It involves sampling sensors at a much higher rate than required. Less the oversampling rate, poor is the smoothening</w:t>
-      </w:r>
-    </w:p>
-    <w:p>
-      <w:pPr>
-        <w:rPr>
-          <w:rFonts w:ascii="Times New Roman" w:hAnsi="Times New Roman" w:cs="Times New Roman"/>
-          <w:b/>
-          <w:bCs/>
-        </w:rPr>
-      </w:pPr>
-      <w:r>
-        <w:rPr>
-          <w:rFonts w:ascii="Times New Roman" w:hAnsi="Times New Roman" w:cs="Times New Roman"/>
-          <w:b/>
-          <w:bCs/>
+        <w:t xml:space="preserve">The averaging filter works as expected, the only drawback is that the fixed CSV of 2000 pkt. is restricting to demonstrate the oversampling of values. </w:t>
+      </w:r>
+      <w:r>
+        <w:rPr>
+          <w:rFonts w:ascii="Times New Roman" w:hAnsi="Times New Roman" w:cs="Times New Roman"/>
+          <w:b/>
+          <w:bCs/>
+        </w:rPr>
+        <w:t xml:space="preserve">Oversampling is a method of smoothening (removing noise/spikes) from the sensor readings to get much more accurate values over a period of time. It involves sampling sensors at a much higher rate than required. Less the oversampling rate, poor is the </w:t>
+      </w:r>
+      <w:proofErr w:type="spellStart"/>
+      <w:r>
+        <w:rPr>
+          <w:rFonts w:ascii="Times New Roman" w:hAnsi="Times New Roman" w:cs="Times New Roman"/>
+          <w:b/>
+          <w:bCs/>
+        </w:rPr>
+        <w:t>smoothenin</w:t>
+      </w:r>
+      <w:proofErr w:type="spellEnd"/>
+    </w:p>
+    <w:p>
+      <w:pPr>
+        <w:pStyle w:val="Heading2"/>
+        <w:jc w:val="center"/>
+        <w:rPr>
+          <w:rFonts w:ascii="Times New Roman" w:hAnsi="Times New Roman" w:cs="Times New Roman"/>
+        </w:rPr>
+      </w:pPr>
+      <w:r>
+        <w:rPr>
+          <w:rFonts w:ascii="Times New Roman" w:hAnsi="Times New Roman" w:cs="Times New Roman"/>
         </w:rPr>
         <w:lastRenderedPageBreak/>
-        <w:t>NEXT STEPS:</w:t>
-      </w:r>
-    </w:p>
-    <w:p>
-      <w:pPr>
-        <w:pStyle w:val="ListParagraph"/>
-        <w:numPr>
-          <w:ilvl w:val="0"/>
-          <w:numId w:val="4"/>
-        </w:numPr>
-        <w:rPr>
-          <w:rFonts w:ascii="Times New Roman" w:hAnsi="Times New Roman" w:cs="Times New Roman"/>
-        </w:rPr>
-      </w:pPr>
-      <w:r>
-        <w:rPr>
-          <w:rFonts w:ascii="Times New Roman" w:hAnsi="Times New Roman" w:cs="Times New Roman"/>
-        </w:rPr>
-        <w:t xml:space="preserve">Upgrade Avg. Filter to Low Pass Filter using a fix </w:t>
+        <w:t>LOW PASS FILTER</w:t>
+      </w:r>
+    </w:p>
+    <w:p>
+      <w:pPr>
+        <w:rPr>
+          <w:rFonts w:ascii="Times New Roman" w:hAnsi="Times New Roman" w:cs="Times New Roman"/>
+        </w:rPr>
+      </w:pPr>
+    </w:p>
+    <w:p>
+      <w:pPr>
+        <w:rPr>
+          <w:rFonts w:ascii="Times New Roman" w:hAnsi="Times New Roman" w:cs="Times New Roman"/>
+          <w:b/>
+          <w:bCs/>
+        </w:rPr>
+      </w:pPr>
+      <w:r>
+        <w:rPr>
+          <w:rFonts w:ascii="Times New Roman" w:hAnsi="Times New Roman" w:cs="Times New Roman"/>
+          <w:b/>
+          <w:bCs/>
+        </w:rPr>
+        <w:t>*Assumptions are same as in the previous test</w:t>
+      </w:r>
+    </w:p>
+    <w:p>
+      <w:pPr>
+        <w:rPr>
+          <w:rFonts w:ascii="Times New Roman" w:hAnsi="Times New Roman" w:cs="Times New Roman"/>
+        </w:rPr>
+      </w:pPr>
+      <w:r>
+        <w:rPr>
+          <w:rFonts w:ascii="Times New Roman" w:hAnsi="Times New Roman" w:cs="Times New Roman"/>
+          <w:b/>
+          <w:bCs/>
+        </w:rPr>
+        <w:t xml:space="preserve">What is a Low Pass Filter: </w:t>
+      </w:r>
+      <w:r>
+        <w:rPr>
+          <w:rFonts w:ascii="Times New Roman" w:hAnsi="Times New Roman" w:cs="Times New Roman"/>
+        </w:rPr>
+        <w:t>Filters out High Frequency noise, only allowing low frequency data for calculations</w:t>
+      </w:r>
+    </w:p>
+    <w:p>
+      <w:pPr>
+        <w:rPr>
+          <w:rFonts w:ascii="Times New Roman" w:hAnsi="Times New Roman" w:cs="Times New Roman"/>
+        </w:rPr>
+      </w:pPr>
+      <w:r>
+        <w:rPr>
+          <w:rFonts w:ascii="Times New Roman" w:hAnsi="Times New Roman" w:cs="Times New Roman"/>
+        </w:rPr>
+        <w:t>Mathematically:</w:t>
+      </w:r>
+    </w:p>
+    <w:p>
+      <w:pPr>
+        <w:rPr>
+          <w:rFonts w:ascii="Times New Roman" w:hAnsi="Times New Roman" w:cs="Times New Roman"/>
+        </w:rPr>
+      </w:pPr>
+      <w:r>
+        <w:rPr>
+          <w:rFonts w:ascii="Times New Roman" w:hAnsi="Times New Roman" w:cs="Times New Roman"/>
+        </w:rPr>
+        <w:tab/>
+      </w:r>
+      <w:r>
+        <w:rPr>
+          <w:rFonts w:ascii="Times New Roman" w:hAnsi="Times New Roman" w:cs="Times New Roman"/>
+        </w:rPr>
+        <w:t xml:space="preserve">                                              </w:t>
+      </w:r>
+      <m:oMath>
+        <m:acc>
+          <m:accPr>
+            <m:chr m:val="̅"/>
+            <m:ctrlPr>
+              <w:rPr>
+                <w:rFonts w:ascii="Cambria Math" w:hAnsi="Cambria Math" w:cs="Times New Roman"/>
+                <w:i/>
+              </w:rPr>
+            </m:ctrlPr>
+          </m:accPr>
+          <m:e>
+            <m:sSub>
+              <m:sSubPr>
+                <m:ctrlPr>
+                  <w:rPr>
+                    <w:rFonts w:ascii="Cambria Math" w:hAnsi="Cambria Math" w:cs="Times New Roman"/>
+                    <w:i/>
+                  </w:rPr>
+                </m:ctrlPr>
+              </m:sSubPr>
+              <m:e>
+                <m:r>
+                  <w:rPr>
+                    <w:rFonts w:ascii="Cambria Math" w:hAnsi="Cambria Math" w:cs="Times New Roman"/>
+                  </w:rPr>
+                  <m:t>x</m:t>
+                </m:r>
+              </m:e>
+              <m:sub>
+                <m:r>
+                  <w:rPr>
+                    <w:rFonts w:ascii="Cambria Math" w:hAnsi="Cambria Math" w:cs="Times New Roman"/>
+                  </w:rPr>
+                  <m:t>k</m:t>
+                </m:r>
+              </m:sub>
+            </m:sSub>
+          </m:e>
+        </m:acc>
+        <m:r>
+          <w:rPr>
+            <w:rFonts w:ascii="Cambria Math" w:hAnsi="Cambria Math" w:cs="Times New Roman"/>
+          </w:rPr>
+          <m:t xml:space="preserve">= α . </m:t>
+        </m:r>
+        <m:acc>
+          <m:accPr>
+            <m:chr m:val="̅"/>
+            <m:ctrlPr>
+              <w:rPr>
+                <w:rFonts w:ascii="Cambria Math" w:hAnsi="Cambria Math" w:cs="Times New Roman"/>
+                <w:i/>
+              </w:rPr>
+            </m:ctrlPr>
+          </m:accPr>
+          <m:e>
+            <m:sSub>
+              <m:sSubPr>
+                <m:ctrlPr>
+                  <w:rPr>
+                    <w:rFonts w:ascii="Cambria Math" w:hAnsi="Cambria Math" w:cs="Times New Roman"/>
+                    <w:i/>
+                  </w:rPr>
+                </m:ctrlPr>
+              </m:sSubPr>
+              <m:e>
+                <m:r>
+                  <w:rPr>
+                    <w:rFonts w:ascii="Cambria Math" w:hAnsi="Cambria Math" w:cs="Times New Roman"/>
+                  </w:rPr>
+                  <m:t>x</m:t>
+                </m:r>
+              </m:e>
+              <m:sub>
+                <m:r>
+                  <w:rPr>
+                    <w:rFonts w:ascii="Cambria Math" w:hAnsi="Cambria Math" w:cs="Times New Roman"/>
+                  </w:rPr>
+                  <m:t>k-1</m:t>
+                </m:r>
+              </m:sub>
+            </m:sSub>
+          </m:e>
+        </m:acc>
+        <m:r>
+          <w:rPr>
+            <w:rFonts w:ascii="Cambria Math" w:hAnsi="Cambria Math" w:cs="Times New Roman"/>
+          </w:rPr>
+          <m:t>+</m:t>
+        </m:r>
+        <m:d>
+          <m:dPr>
+            <m:ctrlPr>
+              <w:rPr>
+                <w:rFonts w:ascii="Cambria Math" w:hAnsi="Cambria Math" w:cs="Times New Roman"/>
+                <w:i/>
+              </w:rPr>
+            </m:ctrlPr>
+          </m:dPr>
+          <m:e>
+            <m:r>
+              <w:rPr>
+                <w:rFonts w:ascii="Cambria Math" w:hAnsi="Cambria Math" w:cs="Times New Roman"/>
+              </w:rPr>
+              <m:t>1- α</m:t>
+            </m:r>
+          </m:e>
+        </m:d>
+        <m:r>
+          <w:rPr>
+            <w:rFonts w:ascii="Cambria Math" w:hAnsi="Cambria Math" w:cs="Times New Roman"/>
+          </w:rPr>
+          <m:t xml:space="preserve">. </m:t>
+        </m:r>
+        <m:sSub>
+          <m:sSubPr>
+            <m:ctrlPr>
+              <w:rPr>
+                <w:rFonts w:ascii="Cambria Math" w:hAnsi="Cambria Math" w:cs="Times New Roman"/>
+                <w:i/>
+              </w:rPr>
+            </m:ctrlPr>
+          </m:sSubPr>
+          <m:e>
+            <m:r>
+              <w:rPr>
+                <w:rFonts w:ascii="Cambria Math" w:hAnsi="Cambria Math" w:cs="Times New Roman"/>
+              </w:rPr>
+              <m:t>x</m:t>
+            </m:r>
+          </m:e>
+          <m:sub>
+            <m:r>
+              <w:rPr>
+                <w:rFonts w:ascii="Cambria Math" w:hAnsi="Cambria Math" w:cs="Times New Roman"/>
+              </w:rPr>
+              <m:t>k</m:t>
+            </m:r>
+          </m:sub>
+        </m:sSub>
+        <m:r>
+          <w:rPr>
+            <w:rFonts w:ascii="Cambria Math" w:hAnsi="Cambria Math" w:cs="Times New Roman"/>
+          </w:rPr>
+          <m:t xml:space="preserve">  </m:t>
+        </m:r>
+      </m:oMath>
+    </w:p>
+    <w:p>
+      <w:pPr>
+        <w:rPr>
+          <w:rFonts w:ascii="Times New Roman" w:eastAsiaTheme="minorEastAsia" w:hAnsi="Times New Roman" w:cs="Times New Roman"/>
+        </w:rPr>
+      </w:pPr>
+      <w:r>
+        <w:rPr>
+          <w:rFonts w:ascii="Times New Roman" w:hAnsi="Times New Roman" w:cs="Times New Roman"/>
+        </w:rPr>
+        <w:t xml:space="preserve">Idea is to take a free variable (weight), and multiply it by previous (k-1) mean and add it to current value by multiplying it to (1 - </w:t>
       </w:r>
       <m:oMath>
         <m:r>
@@ -1200,7 +1447,98 @@
         <w:rPr>
           <w:rFonts w:ascii="Times New Roman" w:eastAsiaTheme="minorEastAsia" w:hAnsi="Times New Roman" w:cs="Times New Roman"/>
         </w:rPr>
-        <w:t xml:space="preserve"> for assigning the weight (importance) to most recent value rather than giving all values the same weight.</w:t>
+        <w:t>).</w:t>
+      </w:r>
+    </w:p>
+    <w:p>
+      <w:pPr>
+        <w:rPr>
+          <w:rFonts w:ascii="Times New Roman" w:eastAsiaTheme="minorEastAsia" w:hAnsi="Times New Roman" w:cs="Times New Roman"/>
+        </w:rPr>
+      </w:pPr>
+      <w:r>
+        <w:rPr>
+          <w:rFonts w:ascii="Times New Roman" w:eastAsiaTheme="minorEastAsia" w:hAnsi="Times New Roman" w:cs="Times New Roman"/>
+        </w:rPr>
+        <w:t xml:space="preserve">Basically, we </w:t>
+      </w:r>
+      <w:r>
+        <w:rPr>
+          <w:rFonts w:ascii="Times New Roman" w:eastAsiaTheme="minorEastAsia" w:hAnsi="Times New Roman" w:cs="Times New Roman"/>
+        </w:rPr>
+        <w:t xml:space="preserve">assign more </w:t>
+      </w:r>
+      <w:r>
+        <w:rPr>
+          <w:rFonts w:ascii="Times New Roman" w:eastAsiaTheme="minorEastAsia" w:hAnsi="Times New Roman" w:cs="Times New Roman"/>
+        </w:rPr>
+        <w:t>weigh</w:t>
+      </w:r>
+      <w:r>
+        <w:rPr>
+          <w:rFonts w:ascii="Times New Roman" w:eastAsiaTheme="minorEastAsia" w:hAnsi="Times New Roman" w:cs="Times New Roman"/>
+        </w:rPr>
+        <w:t xml:space="preserve">t </w:t>
+      </w:r>
+      <w:r>
+        <w:rPr>
+          <w:rFonts w:ascii="Times New Roman" w:eastAsiaTheme="minorEastAsia" w:hAnsi="Times New Roman" w:cs="Times New Roman"/>
+        </w:rPr>
+        <w:t xml:space="preserve">to the latest reading, instead of </w:t>
+      </w:r>
+      <w:r>
+        <w:rPr>
+          <w:rFonts w:ascii="Times New Roman" w:eastAsiaTheme="minorEastAsia" w:hAnsi="Times New Roman" w:cs="Times New Roman"/>
+        </w:rPr>
+        <w:t xml:space="preserve">assigning equal </w:t>
+      </w:r>
+      <w:r>
+        <w:rPr>
+          <w:rFonts w:ascii="Times New Roman" w:eastAsiaTheme="minorEastAsia" w:hAnsi="Times New Roman" w:cs="Times New Roman"/>
+        </w:rPr>
+        <w:t xml:space="preserve">weight </w:t>
+      </w:r>
+      <w:r>
+        <w:rPr>
+          <w:rFonts w:ascii="Times New Roman" w:eastAsiaTheme="minorEastAsia" w:hAnsi="Times New Roman" w:cs="Times New Roman"/>
+        </w:rPr>
+        <w:t xml:space="preserve">to </w:t>
+      </w:r>
+      <w:r>
+        <w:rPr>
+          <w:rFonts w:ascii="Times New Roman" w:eastAsiaTheme="minorEastAsia" w:hAnsi="Times New Roman" w:cs="Times New Roman"/>
+        </w:rPr>
+        <w:t>every reading in case of rolling avg. filter (self-explanatory)</w:t>
+      </w:r>
+      <w:r>
+        <w:rPr>
+          <w:rFonts w:ascii="Times New Roman" w:eastAsiaTheme="minorEastAsia" w:hAnsi="Times New Roman" w:cs="Times New Roman"/>
+        </w:rPr>
+        <w:t>.</w:t>
+      </w:r>
+    </w:p>
+    <w:p>
+      <w:pPr>
+        <w:rPr>
+          <w:rFonts w:ascii="Times New Roman" w:eastAsiaTheme="minorEastAsia" w:hAnsi="Times New Roman" w:cs="Times New Roman"/>
+        </w:rPr>
+      </w:pPr>
+    </w:p>
+    <w:p>
+      <w:pPr>
+        <w:rPr>
+          <w:rFonts w:ascii="Times New Roman" w:hAnsi="Times New Roman" w:cs="Times New Roman"/>
+          <w:b/>
+          <w:bCs/>
+        </w:rPr>
+      </w:pPr>
+      <w:r>
+        <w:rPr>
+          <w:rFonts w:ascii="Times New Roman" w:hAnsi="Times New Roman" w:cs="Times New Roman"/>
+          <w:b/>
+          <w:bCs/>
+        </w:rPr>
+        <w:t>Results:</w:t>
       </w:r>
     </w:p>
     <w:p>
@@ -1208,18 +1546,108 @@
         <w:pStyle w:val="ListParagraph"/>
         <w:numPr>
           <w:ilvl w:val="0"/>
-          <w:numId w:val="4"/>
+          <w:numId w:val="5"/>
         </w:numPr>
         <w:rPr>
           <w:rFonts w:ascii="Times New Roman" w:hAnsi="Times New Roman" w:cs="Times New Roman"/>
-        </w:rPr>
-      </w:pPr>
+          <w:b/>
+          <w:bCs/>
+        </w:rPr>
+      </w:pPr>
+      <m:oMath>
+        <m:r>
+          <w:rPr>
+            <w:rFonts w:ascii="Cambria Math" w:hAnsi="Cambria Math" w:cs="Times New Roman"/>
+          </w:rPr>
+          <m:t>α=0.7</m:t>
+        </m:r>
+      </m:oMath>
       <w:r>
         <w:rPr>
           <w:rFonts w:ascii="Times New Roman" w:eastAsiaTheme="minorEastAsia" w:hAnsi="Times New Roman" w:cs="Times New Roman"/>
         </w:rPr>
-        <w:t xml:space="preserve">Improving LPF with fix </w:t>
-      </w:r>
+        <w:t xml:space="preserve"> @ 10 Hz.</w:t>
+      </w:r>
+    </w:p>
+    <w:p>
+      <w:pPr>
+        <w:pStyle w:val="ListParagraph"/>
+        <w:rPr>
+          <w:rFonts w:ascii="Times New Roman" w:eastAsiaTheme="minorEastAsia" w:hAnsi="Times New Roman" w:cs="Times New Roman"/>
+        </w:rPr>
+      </w:pPr>
+      <w:r>
+        <w:rPr>
+          <w:rFonts w:ascii="Times New Roman" w:eastAsiaTheme="minorEastAsia" w:hAnsi="Times New Roman" w:cs="Times New Roman"/>
+          <w:noProof/>
+        </w:rPr>
+        <w:drawing>
+          <wp:inline distT="0" distB="0" distL="0" distR="0" wp14:anchorId="2442A487" wp14:editId="4C78BACD">
+            <wp:extent cx="4441371" cy="2467210"/>
+            <wp:effectExtent l="0" t="0" r="0" b="9525"/>
+            <wp:docPr id="167671560" name="Picture 1"/>
+            <wp:cNvGraphicFramePr>
+              <a:graphicFrameLocks xmlns:a="http://schemas.openxmlformats.org/drawingml/2006/main" noChangeAspect="1"/>
+            </wp:cNvGraphicFramePr>
+            <a:graphic xmlns:a="http://schemas.openxmlformats.org/drawingml/2006/main">
+              <a:graphicData uri="http://schemas.openxmlformats.org/drawingml/2006/picture">
+                <pic:pic xmlns:pic="http://schemas.openxmlformats.org/drawingml/2006/picture">
+                  <pic:nvPicPr>
+                    <pic:cNvPr id="0" name="Picture 1"/>
+                    <pic:cNvPicPr>
+                      <a:picLocks noChangeAspect="1" noChangeArrowheads="1"/>
+                    </pic:cNvPicPr>
+                  </pic:nvPicPr>
+                  <pic:blipFill>
+                    <a:blip r:embed="rId18" cstate="print">
+                      <a:extLst>
+                        <a:ext uri="{28A0092B-C50C-407E-A947-70E740481C1C}">
+                          <a14:useLocalDpi xmlns:a14="http://schemas.microsoft.com/office/drawing/2010/main" val="0"/>
+                        </a:ext>
+                      </a:extLst>
+                    </a:blip>
+                    <a:srcRect/>
+                    <a:stretch>
+                      <a:fillRect/>
+                    </a:stretch>
+                  </pic:blipFill>
+                  <pic:spPr bwMode="auto">
+                    <a:xfrm>
+                      <a:off x="0" y="0"/>
+                      <a:ext cx="4454499" cy="2474503"/>
+                    </a:xfrm>
+                    <a:prstGeom prst="rect">
+                      <a:avLst/>
+                    </a:prstGeom>
+                    <a:noFill/>
+                    <a:ln>
+                      <a:noFill/>
+                    </a:ln>
+                  </pic:spPr>
+                </pic:pic>
+              </a:graphicData>
+            </a:graphic>
+          </wp:inline>
+        </w:drawing>
+      </w:r>
+      <w:r>
+        <w:rPr>
+          <w:rFonts w:ascii="Times New Roman" w:eastAsiaTheme="minorEastAsia" w:hAnsi="Times New Roman" w:cs="Times New Roman"/>
+        </w:rPr>
+        <w:t xml:space="preserve">       </w:t>
+      </w:r>
+    </w:p>
+    <w:p>
+      <w:pPr>
+        <w:pStyle w:val="ListParagraph"/>
+        <w:numPr>
+          <w:ilvl w:val="0"/>
+          <w:numId w:val="5"/>
+        </w:numPr>
+        <w:rPr>
+          <w:rFonts w:ascii="Times New Roman" w:hAnsi="Times New Roman" w:cs="Times New Roman"/>
+        </w:rPr>
+      </w:pPr>
       <m:oMath>
         <m:r>
           <w:rPr>
@@ -1232,7 +1660,449 @@
         <w:rPr>
           <w:rFonts w:ascii="Times New Roman" w:eastAsiaTheme="minorEastAsia" w:hAnsi="Times New Roman" w:cs="Times New Roman"/>
         </w:rPr>
-        <w:t xml:space="preserve"> to dynamic </w:t>
+        <w:t xml:space="preserve"> = </w:t>
+      </w:r>
+      <w:proofErr w:type="gramStart"/>
+      <w:r>
+        <w:rPr>
+          <w:rFonts w:ascii="Times New Roman" w:eastAsiaTheme="minorEastAsia" w:hAnsi="Times New Roman" w:cs="Times New Roman"/>
+        </w:rPr>
+        <w:t>0.7  @</w:t>
+      </w:r>
+      <w:proofErr w:type="gramEnd"/>
+      <w:r>
+        <w:rPr>
+          <w:rFonts w:ascii="Times New Roman" w:eastAsiaTheme="minorEastAsia" w:hAnsi="Times New Roman" w:cs="Times New Roman"/>
+        </w:rPr>
+        <w:t xml:space="preserve"> 50 Hz.</w:t>
+      </w:r>
+    </w:p>
+    <w:p>
+      <w:pPr>
+        <w:pStyle w:val="ListParagraph"/>
+        <w:rPr>
+          <w:rFonts w:ascii="Times New Roman" w:hAnsi="Times New Roman" w:cs="Times New Roman"/>
+        </w:rPr>
+      </w:pPr>
+      <w:r>
+        <w:rPr>
+          <w:rFonts w:ascii="Times New Roman" w:hAnsi="Times New Roman" w:cs="Times New Roman"/>
+          <w:noProof/>
+        </w:rPr>
+        <w:drawing>
+          <wp:inline distT="0" distB="0" distL="0" distR="0" wp14:anchorId="071C3BEF" wp14:editId="22C72239">
+            <wp:extent cx="4398970" cy="2443655"/>
+            <wp:effectExtent l="0" t="0" r="1905" b="0"/>
+            <wp:docPr id="210553582" name="Picture 3"/>
+            <wp:cNvGraphicFramePr>
+              <a:graphicFrameLocks xmlns:a="http://schemas.openxmlformats.org/drawingml/2006/main" noChangeAspect="1"/>
+            </wp:cNvGraphicFramePr>
+            <a:graphic xmlns:a="http://schemas.openxmlformats.org/drawingml/2006/main">
+              <a:graphicData uri="http://schemas.openxmlformats.org/drawingml/2006/picture">
+                <pic:pic xmlns:pic="http://schemas.openxmlformats.org/drawingml/2006/picture">
+                  <pic:nvPicPr>
+                    <pic:cNvPr id="0" name="Picture 3"/>
+                    <pic:cNvPicPr>
+                      <a:picLocks noChangeAspect="1" noChangeArrowheads="1"/>
+                    </pic:cNvPicPr>
+                  </pic:nvPicPr>
+                  <pic:blipFill>
+                    <a:blip r:embed="rId19" cstate="print">
+                      <a:extLst>
+                        <a:ext uri="{28A0092B-C50C-407E-A947-70E740481C1C}">
+                          <a14:useLocalDpi xmlns:a14="http://schemas.microsoft.com/office/drawing/2010/main" val="0"/>
+                        </a:ext>
+                      </a:extLst>
+                    </a:blip>
+                    <a:srcRect/>
+                    <a:stretch>
+                      <a:fillRect/>
+                    </a:stretch>
+                  </pic:blipFill>
+                  <pic:spPr bwMode="auto">
+                    <a:xfrm>
+                      <a:off x="0" y="0"/>
+                      <a:ext cx="4416228" cy="2453242"/>
+                    </a:xfrm>
+                    <a:prstGeom prst="rect">
+                      <a:avLst/>
+                    </a:prstGeom>
+                    <a:noFill/>
+                    <a:ln>
+                      <a:noFill/>
+                    </a:ln>
+                  </pic:spPr>
+                </pic:pic>
+              </a:graphicData>
+            </a:graphic>
+          </wp:inline>
+        </w:drawing>
+      </w:r>
+    </w:p>
+    <w:p>
+      <w:pPr>
+        <w:pStyle w:val="ListParagraph"/>
+        <w:rPr>
+          <w:rFonts w:ascii="Times New Roman" w:hAnsi="Times New Roman" w:cs="Times New Roman"/>
+        </w:rPr>
+      </w:pPr>
+    </w:p>
+    <w:p>
+      <w:pPr>
+        <w:pStyle w:val="ListParagraph"/>
+        <w:numPr>
+          <w:ilvl w:val="0"/>
+          <w:numId w:val="5"/>
+        </w:numPr>
+        <w:rPr>
+          <w:rFonts w:ascii="Times New Roman" w:hAnsi="Times New Roman" w:cs="Times New Roman"/>
+        </w:rPr>
+      </w:pPr>
+      <m:oMath>
+        <m:r>
+          <w:rPr>
+            <w:rFonts w:ascii="Cambria Math" w:hAnsi="Cambria Math" w:cs="Times New Roman"/>
+          </w:rPr>
+          <w:lastRenderedPageBreak/>
+          <m:t xml:space="preserve">α=0.7 </m:t>
+        </m:r>
+      </m:oMath>
+      <w:r>
+        <w:rPr>
+          <w:rFonts w:ascii="Times New Roman" w:eastAsiaTheme="minorEastAsia" w:hAnsi="Times New Roman" w:cs="Times New Roman"/>
+        </w:rPr>
+        <w:t>@ 100 Hz</w:t>
+      </w:r>
+    </w:p>
+    <w:p>
+      <w:pPr>
+        <w:pStyle w:val="ListParagraph"/>
+        <w:rPr>
+          <w:rFonts w:ascii="Times New Roman" w:hAnsi="Times New Roman" w:cs="Times New Roman"/>
+        </w:rPr>
+      </w:pPr>
+      <w:r>
+        <w:rPr>
+          <w:rFonts w:ascii="Times New Roman" w:hAnsi="Times New Roman" w:cs="Times New Roman"/>
+          <w:noProof/>
+        </w:rPr>
+        <w:drawing>
+          <wp:inline distT="0" distB="0" distL="0" distR="0" wp14:anchorId="3042DE51" wp14:editId="34262120">
+            <wp:extent cx="4884522" cy="2713383"/>
+            <wp:effectExtent l="0" t="0" r="0" b="0"/>
+            <wp:docPr id="7850432" name="Picture 4"/>
+            <wp:cNvGraphicFramePr>
+              <a:graphicFrameLocks xmlns:a="http://schemas.openxmlformats.org/drawingml/2006/main" noChangeAspect="1"/>
+            </wp:cNvGraphicFramePr>
+            <a:graphic xmlns:a="http://schemas.openxmlformats.org/drawingml/2006/main">
+              <a:graphicData uri="http://schemas.openxmlformats.org/drawingml/2006/picture">
+                <pic:pic xmlns:pic="http://schemas.openxmlformats.org/drawingml/2006/picture">
+                  <pic:nvPicPr>
+                    <pic:cNvPr id="0" name="Picture 4"/>
+                    <pic:cNvPicPr>
+                      <a:picLocks noChangeAspect="1" noChangeArrowheads="1"/>
+                    </pic:cNvPicPr>
+                  </pic:nvPicPr>
+                  <pic:blipFill>
+                    <a:blip r:embed="rId20" cstate="print">
+                      <a:extLst>
+                        <a:ext uri="{28A0092B-C50C-407E-A947-70E740481C1C}">
+                          <a14:useLocalDpi xmlns:a14="http://schemas.microsoft.com/office/drawing/2010/main" val="0"/>
+                        </a:ext>
+                      </a:extLst>
+                    </a:blip>
+                    <a:srcRect/>
+                    <a:stretch>
+                      <a:fillRect/>
+                    </a:stretch>
+                  </pic:blipFill>
+                  <pic:spPr bwMode="auto">
+                    <a:xfrm>
+                      <a:off x="0" y="0"/>
+                      <a:ext cx="4893318" cy="2718269"/>
+                    </a:xfrm>
+                    <a:prstGeom prst="rect">
+                      <a:avLst/>
+                    </a:prstGeom>
+                    <a:noFill/>
+                    <a:ln>
+                      <a:noFill/>
+                    </a:ln>
+                  </pic:spPr>
+                </pic:pic>
+              </a:graphicData>
+            </a:graphic>
+          </wp:inline>
+        </w:drawing>
+      </w:r>
+    </w:p>
+    <w:p>
+      <w:pPr>
+        <w:rPr>
+          <w:rFonts w:ascii="Times New Roman" w:hAnsi="Times New Roman" w:cs="Times New Roman"/>
+        </w:rPr>
+      </w:pPr>
+      <w:r>
+        <w:rPr>
+          <w:rFonts w:ascii="Times New Roman" w:hAnsi="Times New Roman" w:cs="Times New Roman"/>
+        </w:rPr>
+        <w:t>Now, let’s see how alpha changes the predictions</w:t>
+      </w:r>
+    </w:p>
+    <w:p>
+      <w:pPr>
+        <w:rPr>
+          <w:rFonts w:ascii="Times New Roman" w:hAnsi="Times New Roman" w:cs="Times New Roman"/>
+        </w:rPr>
+      </w:pPr>
+      <w:proofErr w:type="gramStart"/>
+      <w:r>
+        <w:rPr>
+          <w:rFonts w:ascii="Times New Roman" w:hAnsi="Times New Roman" w:cs="Times New Roman"/>
+        </w:rPr>
+        <w:t>TL;DR</w:t>
+      </w:r>
+      <w:proofErr w:type="gramEnd"/>
+      <w:r>
+        <w:rPr>
+          <w:rFonts w:ascii="Times New Roman" w:hAnsi="Times New Roman" w:cs="Times New Roman"/>
+        </w:rPr>
+        <w:t xml:space="preserve"> More Alpha, More accuracy and vice-versa</w:t>
+      </w:r>
+    </w:p>
+    <w:p>
+      <w:pPr>
+        <w:pStyle w:val="ListParagraph"/>
+        <w:numPr>
+          <w:ilvl w:val="0"/>
+          <w:numId w:val="6"/>
+        </w:numPr>
+        <w:rPr>
+          <w:rFonts w:ascii="Times New Roman" w:hAnsi="Times New Roman" w:cs="Times New Roman"/>
+        </w:rPr>
+      </w:pPr>
+      <m:oMath>
+        <m:r>
+          <w:rPr>
+            <w:rFonts w:ascii="Cambria Math" w:hAnsi="Cambria Math" w:cs="Times New Roman"/>
+          </w:rPr>
+          <m:t>α=0.4</m:t>
+        </m:r>
+      </m:oMath>
+      <w:r>
+        <w:rPr>
+          <w:rFonts w:ascii="Times New Roman" w:eastAsiaTheme="minorEastAsia" w:hAnsi="Times New Roman" w:cs="Times New Roman"/>
+        </w:rPr>
+        <w:t xml:space="preserve"> @ 10 Hz</w:t>
+      </w:r>
+    </w:p>
+    <w:p>
+      <w:pPr>
+        <w:pStyle w:val="ListParagraph"/>
+        <w:rPr>
+          <w:rFonts w:ascii="Times New Roman" w:hAnsi="Times New Roman" w:cs="Times New Roman"/>
+        </w:rPr>
+      </w:pPr>
+      <w:r>
+        <w:rPr>
+          <w:rFonts w:ascii="Times New Roman" w:hAnsi="Times New Roman" w:cs="Times New Roman"/>
+          <w:noProof/>
+        </w:rPr>
+        <w:drawing>
+          <wp:inline distT="0" distB="0" distL="0" distR="0" wp14:anchorId="4993B417" wp14:editId="51653EC6">
+            <wp:extent cx="4517112" cy="2509284"/>
+            <wp:effectExtent l="0" t="0" r="0" b="5715"/>
+            <wp:docPr id="422083642" name="Picture 5"/>
+            <wp:cNvGraphicFramePr>
+              <a:graphicFrameLocks xmlns:a="http://schemas.openxmlformats.org/drawingml/2006/main" noChangeAspect="1"/>
+            </wp:cNvGraphicFramePr>
+            <a:graphic xmlns:a="http://schemas.openxmlformats.org/drawingml/2006/main">
+              <a:graphicData uri="http://schemas.openxmlformats.org/drawingml/2006/picture">
+                <pic:pic xmlns:pic="http://schemas.openxmlformats.org/drawingml/2006/picture">
+                  <pic:nvPicPr>
+                    <pic:cNvPr id="0" name="Picture 5"/>
+                    <pic:cNvPicPr>
+                      <a:picLocks noChangeAspect="1" noChangeArrowheads="1"/>
+                    </pic:cNvPicPr>
+                  </pic:nvPicPr>
+                  <pic:blipFill>
+                    <a:blip r:embed="rId21" cstate="print">
+                      <a:extLst>
+                        <a:ext uri="{28A0092B-C50C-407E-A947-70E740481C1C}">
+                          <a14:useLocalDpi xmlns:a14="http://schemas.microsoft.com/office/drawing/2010/main" val="0"/>
+                        </a:ext>
+                      </a:extLst>
+                    </a:blip>
+                    <a:srcRect/>
+                    <a:stretch>
+                      <a:fillRect/>
+                    </a:stretch>
+                  </pic:blipFill>
+                  <pic:spPr bwMode="auto">
+                    <a:xfrm>
+                      <a:off x="0" y="0"/>
+                      <a:ext cx="4530102" cy="2516500"/>
+                    </a:xfrm>
+                    <a:prstGeom prst="rect">
+                      <a:avLst/>
+                    </a:prstGeom>
+                    <a:noFill/>
+                    <a:ln>
+                      <a:noFill/>
+                    </a:ln>
+                  </pic:spPr>
+                </pic:pic>
+              </a:graphicData>
+            </a:graphic>
+          </wp:inline>
+        </w:drawing>
+      </w:r>
+    </w:p>
+    <w:p>
+      <w:pPr>
+        <w:pStyle w:val="ListParagraph"/>
+        <w:rPr>
+          <w:rFonts w:ascii="Times New Roman" w:hAnsi="Times New Roman" w:cs="Times New Roman"/>
+        </w:rPr>
+      </w:pPr>
+      <w:r>
+        <w:rPr>
+          <w:rFonts w:ascii="Times New Roman" w:hAnsi="Times New Roman" w:cs="Times New Roman"/>
+          <w:noProof/>
+        </w:rPr>
+        <w:drawing>
+          <wp:inline distT="0" distB="0" distL="0" distR="0" wp14:anchorId="50308850" wp14:editId="2356BB89">
+            <wp:extent cx="4556913" cy="2119423"/>
+            <wp:effectExtent l="0" t="0" r="0" b="0"/>
+            <wp:docPr id="77515395" name="Picture 6"/>
+            <wp:cNvGraphicFramePr>
+              <a:graphicFrameLocks xmlns:a="http://schemas.openxmlformats.org/drawingml/2006/main" noChangeAspect="1"/>
+            </wp:cNvGraphicFramePr>
+            <a:graphic xmlns:a="http://schemas.openxmlformats.org/drawingml/2006/main">
+              <a:graphicData uri="http://schemas.openxmlformats.org/drawingml/2006/picture">
+                <pic:pic xmlns:pic="http://schemas.openxmlformats.org/drawingml/2006/picture">
+                  <pic:nvPicPr>
+                    <pic:cNvPr id="0" name="Picture 6"/>
+                    <pic:cNvPicPr>
+                      <a:picLocks noChangeAspect="1" noChangeArrowheads="1"/>
+                    </pic:cNvPicPr>
+                  </pic:nvPicPr>
+                  <pic:blipFill>
+                    <a:blip r:embed="rId22" cstate="print">
+                      <a:extLst>
+                        <a:ext uri="{28A0092B-C50C-407E-A947-70E740481C1C}">
+                          <a14:useLocalDpi xmlns:a14="http://schemas.microsoft.com/office/drawing/2010/main" val="0"/>
+                        </a:ext>
+                      </a:extLst>
+                    </a:blip>
+                    <a:srcRect/>
+                    <a:stretch>
+                      <a:fillRect/>
+                    </a:stretch>
+                  </pic:blipFill>
+                  <pic:spPr bwMode="auto">
+                    <a:xfrm>
+                      <a:off x="0" y="0"/>
+                      <a:ext cx="4573924" cy="2127335"/>
+                    </a:xfrm>
+                    <a:prstGeom prst="rect">
+                      <a:avLst/>
+                    </a:prstGeom>
+                    <a:noFill/>
+                    <a:ln>
+                      <a:noFill/>
+                    </a:ln>
+                  </pic:spPr>
+                </pic:pic>
+              </a:graphicData>
+            </a:graphic>
+          </wp:inline>
+        </w:drawing>
+      </w:r>
+    </w:p>
+    <w:p>
+      <w:pPr>
+        <w:pStyle w:val="ListParagraph"/>
+        <w:rPr>
+          <w:rFonts w:ascii="Times New Roman" w:hAnsi="Times New Roman" w:cs="Times New Roman"/>
+        </w:rPr>
+      </w:pPr>
+      <w:r>
+        <w:rPr>
+          <w:rFonts w:ascii="Times New Roman" w:hAnsi="Times New Roman" w:cs="Times New Roman"/>
+          <w:noProof/>
+        </w:rPr>
+        <w:lastRenderedPageBreak/>
+        <w:drawing>
+          <wp:inline distT="0" distB="0" distL="0" distR="0" wp14:anchorId="09000B87" wp14:editId="6EB14FFE">
+            <wp:extent cx="4720046" cy="2195820"/>
+            <wp:effectExtent l="0" t="0" r="4445" b="0"/>
+            <wp:docPr id="2004312071" name="Picture 7"/>
+            <wp:cNvGraphicFramePr>
+              <a:graphicFrameLocks xmlns:a="http://schemas.openxmlformats.org/drawingml/2006/main" noChangeAspect="1"/>
+            </wp:cNvGraphicFramePr>
+            <a:graphic xmlns:a="http://schemas.openxmlformats.org/drawingml/2006/main">
+              <a:graphicData uri="http://schemas.openxmlformats.org/drawingml/2006/picture">
+                <pic:pic xmlns:pic="http://schemas.openxmlformats.org/drawingml/2006/picture">
+                  <pic:nvPicPr>
+                    <pic:cNvPr id="0" name="Picture 7"/>
+                    <pic:cNvPicPr>
+                      <a:picLocks noChangeAspect="1" noChangeArrowheads="1"/>
+                    </pic:cNvPicPr>
+                  </pic:nvPicPr>
+                  <pic:blipFill>
+                    <a:blip r:embed="rId23" cstate="print">
+                      <a:extLst>
+                        <a:ext uri="{28A0092B-C50C-407E-A947-70E740481C1C}">
+                          <a14:useLocalDpi xmlns:a14="http://schemas.microsoft.com/office/drawing/2010/main" val="0"/>
+                        </a:ext>
+                      </a:extLst>
+                    </a:blip>
+                    <a:srcRect/>
+                    <a:stretch>
+                      <a:fillRect/>
+                    </a:stretch>
+                  </pic:blipFill>
+                  <pic:spPr bwMode="auto">
+                    <a:xfrm>
+                      <a:off x="0" y="0"/>
+                      <a:ext cx="4726649" cy="2198892"/>
+                    </a:xfrm>
+                    <a:prstGeom prst="rect">
+                      <a:avLst/>
+                    </a:prstGeom>
+                    <a:noFill/>
+                    <a:ln>
+                      <a:noFill/>
+                    </a:ln>
+                  </pic:spPr>
+                </pic:pic>
+              </a:graphicData>
+            </a:graphic>
+          </wp:inline>
+        </w:drawing>
+      </w:r>
+    </w:p>
+    <w:p>
+      <w:pPr>
+        <w:pStyle w:val="ListParagraph"/>
+        <w:rPr>
+          <w:rFonts w:ascii="Times New Roman" w:hAnsi="Times New Roman" w:cs="Times New Roman"/>
+        </w:rPr>
+      </w:pPr>
+    </w:p>
+    <w:p>
+      <w:pPr>
+        <w:pStyle w:val="ListParagraph"/>
+        <w:rPr>
+          <w:rFonts w:ascii="Times New Roman" w:eastAsiaTheme="minorEastAsia" w:hAnsi="Times New Roman" w:cs="Times New Roman"/>
+        </w:rPr>
+      </w:pPr>
+      <w:r>
+        <w:rPr>
+          <w:rFonts w:ascii="Times New Roman" w:hAnsi="Times New Roman" w:cs="Times New Roman"/>
+        </w:rPr>
+        <w:t xml:space="preserve">As in the plots, after decreasing the </w:t>
       </w:r>
       <m:oMath>
         <m:r>
@@ -1246,8 +2116,2259 @@
         <w:rPr>
           <w:rFonts w:ascii="Times New Roman" w:eastAsiaTheme="minorEastAsia" w:hAnsi="Times New Roman" w:cs="Times New Roman"/>
         </w:rPr>
-        <w:t xml:space="preserve"> and applying Kalman filter to get Velocity from Altitude values, without even needing to measure the Velocity using standard equation.</w:t>
-      </w:r>
+        <w:t>, the smoothening effect is not as good as with 0.7.</w:t>
+      </w:r>
+    </w:p>
+    <w:p>
+      <w:pPr>
+        <w:pStyle w:val="ListParagraph"/>
+        <w:rPr>
+          <w:rFonts w:ascii="Times New Roman" w:eastAsiaTheme="minorEastAsia" w:hAnsi="Times New Roman" w:cs="Times New Roman"/>
+        </w:rPr>
+      </w:pPr>
+    </w:p>
+    <w:p>
+      <w:pPr>
+        <w:pStyle w:val="ListParagraph"/>
+        <w:numPr>
+          <w:ilvl w:val="0"/>
+          <w:numId w:val="6"/>
+        </w:numPr>
+        <w:rPr>
+          <w:rFonts w:ascii="Times New Roman" w:hAnsi="Times New Roman" w:cs="Times New Roman"/>
+        </w:rPr>
+      </w:pPr>
+      <m:oMath>
+        <m:r>
+          <w:rPr>
+            <w:rFonts w:ascii="Cambria Math" w:hAnsi="Cambria Math" w:cs="Times New Roman"/>
+          </w:rPr>
+          <m:t>α=0.8</m:t>
+        </m:r>
+      </m:oMath>
+      <w:r>
+        <w:rPr>
+          <w:rFonts w:ascii="Times New Roman" w:eastAsiaTheme="minorEastAsia" w:hAnsi="Times New Roman" w:cs="Times New Roman"/>
+        </w:rPr>
+        <w:t xml:space="preserve"> @ 10 Hz</w:t>
+      </w:r>
+    </w:p>
+    <w:p>
+      <w:pPr>
+        <w:pStyle w:val="ListParagraph"/>
+        <w:rPr>
+          <w:rFonts w:ascii="Times New Roman" w:hAnsi="Times New Roman" w:cs="Times New Roman"/>
+        </w:rPr>
+      </w:pPr>
+      <w:r>
+        <w:rPr>
+          <w:rFonts w:ascii="Times New Roman" w:hAnsi="Times New Roman" w:cs="Times New Roman"/>
+          <w:noProof/>
+        </w:rPr>
+        <w:drawing>
+          <wp:inline distT="0" distB="0" distL="0" distR="0" wp14:anchorId="2C2D7FC1" wp14:editId="410B6F15">
+            <wp:extent cx="4598126" cy="2554288"/>
+            <wp:effectExtent l="0" t="0" r="0" b="0"/>
+            <wp:docPr id="1778320511" name="Picture 8"/>
+            <wp:cNvGraphicFramePr>
+              <a:graphicFrameLocks xmlns:a="http://schemas.openxmlformats.org/drawingml/2006/main" noChangeAspect="1"/>
+            </wp:cNvGraphicFramePr>
+            <a:graphic xmlns:a="http://schemas.openxmlformats.org/drawingml/2006/main">
+              <a:graphicData uri="http://schemas.openxmlformats.org/drawingml/2006/picture">
+                <pic:pic xmlns:pic="http://schemas.openxmlformats.org/drawingml/2006/picture">
+                  <pic:nvPicPr>
+                    <pic:cNvPr id="0" name="Picture 8"/>
+                    <pic:cNvPicPr>
+                      <a:picLocks noChangeAspect="1" noChangeArrowheads="1"/>
+                    </pic:cNvPicPr>
+                  </pic:nvPicPr>
+                  <pic:blipFill>
+                    <a:blip r:embed="rId24" cstate="print">
+                      <a:extLst>
+                        <a:ext uri="{28A0092B-C50C-407E-A947-70E740481C1C}">
+                          <a14:useLocalDpi xmlns:a14="http://schemas.microsoft.com/office/drawing/2010/main" val="0"/>
+                        </a:ext>
+                      </a:extLst>
+                    </a:blip>
+                    <a:srcRect/>
+                    <a:stretch>
+                      <a:fillRect/>
+                    </a:stretch>
+                  </pic:blipFill>
+                  <pic:spPr bwMode="auto">
+                    <a:xfrm>
+                      <a:off x="0" y="0"/>
+                      <a:ext cx="4613008" cy="2562555"/>
+                    </a:xfrm>
+                    <a:prstGeom prst="rect">
+                      <a:avLst/>
+                    </a:prstGeom>
+                    <a:noFill/>
+                    <a:ln>
+                      <a:noFill/>
+                    </a:ln>
+                  </pic:spPr>
+                </pic:pic>
+              </a:graphicData>
+            </a:graphic>
+          </wp:inline>
+        </w:drawing>
+      </w:r>
+    </w:p>
+    <w:p>
+      <w:pPr>
+        <w:pStyle w:val="ListParagraph"/>
+        <w:rPr>
+          <w:rFonts w:ascii="Times New Roman" w:hAnsi="Times New Roman" w:cs="Times New Roman"/>
+        </w:rPr>
+      </w:pPr>
+      <w:r>
+        <w:rPr>
+          <w:rFonts w:ascii="Times New Roman" w:hAnsi="Times New Roman" w:cs="Times New Roman"/>
+          <w:noProof/>
+        </w:rPr>
+        <w:drawing>
+          <wp:inline distT="0" distB="0" distL="0" distR="0" wp14:anchorId="494823C9" wp14:editId="1F25709F">
+            <wp:extent cx="4657119" cy="2072640"/>
+            <wp:effectExtent l="0" t="0" r="0" b="3810"/>
+            <wp:docPr id="1494814436" name="Picture 9"/>
+            <wp:cNvGraphicFramePr>
+              <a:graphicFrameLocks xmlns:a="http://schemas.openxmlformats.org/drawingml/2006/main" noChangeAspect="1"/>
+            </wp:cNvGraphicFramePr>
+            <a:graphic xmlns:a="http://schemas.openxmlformats.org/drawingml/2006/main">
+              <a:graphicData uri="http://schemas.openxmlformats.org/drawingml/2006/picture">
+                <pic:pic xmlns:pic="http://schemas.openxmlformats.org/drawingml/2006/picture">
+                  <pic:nvPicPr>
+                    <pic:cNvPr id="0" name="Picture 9"/>
+                    <pic:cNvPicPr>
+                      <a:picLocks noChangeAspect="1" noChangeArrowheads="1"/>
+                    </pic:cNvPicPr>
+                  </pic:nvPicPr>
+                  <pic:blipFill>
+                    <a:blip r:embed="rId25" cstate="print">
+                      <a:extLst>
+                        <a:ext uri="{28A0092B-C50C-407E-A947-70E740481C1C}">
+                          <a14:useLocalDpi xmlns:a14="http://schemas.microsoft.com/office/drawing/2010/main" val="0"/>
+                        </a:ext>
+                      </a:extLst>
+                    </a:blip>
+                    <a:srcRect/>
+                    <a:stretch>
+                      <a:fillRect/>
+                    </a:stretch>
+                  </pic:blipFill>
+                  <pic:spPr bwMode="auto">
+                    <a:xfrm>
+                      <a:off x="0" y="0"/>
+                      <a:ext cx="4667569" cy="2077291"/>
+                    </a:xfrm>
+                    <a:prstGeom prst="rect">
+                      <a:avLst/>
+                    </a:prstGeom>
+                    <a:noFill/>
+                    <a:ln>
+                      <a:noFill/>
+                    </a:ln>
+                  </pic:spPr>
+                </pic:pic>
+              </a:graphicData>
+            </a:graphic>
+          </wp:inline>
+        </w:drawing>
+      </w:r>
+    </w:p>
+    <w:p>
+      <w:pPr>
+        <w:rPr>
+          <w:rFonts w:ascii="Times New Roman" w:hAnsi="Times New Roman" w:cs="Times New Roman"/>
+        </w:rPr>
+      </w:pPr>
+    </w:p>
+    <w:p>
+      <w:pPr>
+        <w:pStyle w:val="ListParagraph"/>
+        <w:rPr>
+          <w:rFonts w:ascii="Times New Roman" w:hAnsi="Times New Roman" w:cs="Times New Roman"/>
+        </w:rPr>
+      </w:pPr>
+      <w:r>
+        <w:rPr>
+          <w:rFonts w:ascii="Times New Roman" w:hAnsi="Times New Roman" w:cs="Times New Roman"/>
+          <w:noProof/>
+        </w:rPr>
+        <w:lastRenderedPageBreak/>
+        <w:drawing>
+          <wp:inline distT="0" distB="0" distL="0" distR="0" wp14:anchorId="3BAA6099" wp14:editId="10A182D9">
+            <wp:extent cx="4563292" cy="2030881"/>
+            <wp:effectExtent l="0" t="0" r="8890" b="7620"/>
+            <wp:docPr id="1384639086" name="Picture 10"/>
+            <wp:cNvGraphicFramePr>
+              <a:graphicFrameLocks xmlns:a="http://schemas.openxmlformats.org/drawingml/2006/main" noChangeAspect="1"/>
+            </wp:cNvGraphicFramePr>
+            <a:graphic xmlns:a="http://schemas.openxmlformats.org/drawingml/2006/main">
+              <a:graphicData uri="http://schemas.openxmlformats.org/drawingml/2006/picture">
+                <pic:pic xmlns:pic="http://schemas.openxmlformats.org/drawingml/2006/picture">
+                  <pic:nvPicPr>
+                    <pic:cNvPr id="0" name="Picture 10"/>
+                    <pic:cNvPicPr>
+                      <a:picLocks noChangeAspect="1" noChangeArrowheads="1"/>
+                    </pic:cNvPicPr>
+                  </pic:nvPicPr>
+                  <pic:blipFill>
+                    <a:blip r:embed="rId26" cstate="print">
+                      <a:extLst>
+                        <a:ext uri="{28A0092B-C50C-407E-A947-70E740481C1C}">
+                          <a14:useLocalDpi xmlns:a14="http://schemas.microsoft.com/office/drawing/2010/main" val="0"/>
+                        </a:ext>
+                      </a:extLst>
+                    </a:blip>
+                    <a:srcRect/>
+                    <a:stretch>
+                      <a:fillRect/>
+                    </a:stretch>
+                  </pic:blipFill>
+                  <pic:spPr bwMode="auto">
+                    <a:xfrm>
+                      <a:off x="0" y="0"/>
+                      <a:ext cx="4606358" cy="2050047"/>
+                    </a:xfrm>
+                    <a:prstGeom prst="rect">
+                      <a:avLst/>
+                    </a:prstGeom>
+                    <a:noFill/>
+                    <a:ln>
+                      <a:noFill/>
+                    </a:ln>
+                  </pic:spPr>
+                </pic:pic>
+              </a:graphicData>
+            </a:graphic>
+          </wp:inline>
+        </w:drawing>
+      </w:r>
+    </w:p>
+    <w:p>
+      <w:pPr>
+        <w:pStyle w:val="ListParagraph"/>
+        <w:rPr>
+          <w:rFonts w:ascii="Times New Roman" w:hAnsi="Times New Roman" w:cs="Times New Roman"/>
+        </w:rPr>
+      </w:pPr>
+    </w:p>
+    <w:p>
+      <w:pPr>
+        <w:pStyle w:val="ListParagraph"/>
+        <w:rPr>
+          <w:rFonts w:ascii="Times New Roman" w:hAnsi="Times New Roman" w:cs="Times New Roman"/>
+        </w:rPr>
+      </w:pPr>
+      <w:r>
+        <w:rPr>
+          <w:rFonts w:ascii="Times New Roman" w:hAnsi="Times New Roman" w:cs="Times New Roman"/>
+        </w:rPr>
+        <w:t>Conclusion, Low pass filter performs comparatively better than rolling average, but the end result remains same. It doesn’t matter what we choose, instead our use case is what that matters.</w:t>
+      </w:r>
+    </w:p>
+    <w:p>
+      <w:pPr>
+        <w:pStyle w:val="ListParagraph"/>
+        <w:rPr>
+          <w:rFonts w:ascii="Times New Roman" w:hAnsi="Times New Roman" w:cs="Times New Roman"/>
+        </w:rPr>
+      </w:pPr>
+    </w:p>
+    <w:p>
+      <w:pPr>
+        <w:pStyle w:val="ListParagraph"/>
+        <w:rPr>
+          <w:rFonts w:ascii="Times New Roman" w:hAnsi="Times New Roman" w:cs="Times New Roman"/>
+        </w:rPr>
+      </w:pPr>
+    </w:p>
+    <w:p>
+      <w:pPr>
+        <w:pStyle w:val="ListParagraph"/>
+        <w:rPr>
+          <w:rFonts w:ascii="Times New Roman" w:hAnsi="Times New Roman" w:cs="Times New Roman"/>
+        </w:rPr>
+      </w:pPr>
+    </w:p>
+    <w:p>
+      <w:pPr>
+        <w:pStyle w:val="ListParagraph"/>
+        <w:rPr>
+          <w:rFonts w:ascii="Times New Roman" w:hAnsi="Times New Roman" w:cs="Times New Roman"/>
+        </w:rPr>
+      </w:pPr>
+      <w:r>
+        <w:rPr>
+          <w:rFonts w:ascii="Times New Roman" w:hAnsi="Times New Roman" w:cs="Times New Roman"/>
+          <w:b/>
+          <w:bCs/>
+        </w:rPr>
+        <w:t xml:space="preserve">Next Steps: </w:t>
+      </w:r>
+      <w:r>
+        <w:rPr>
+          <w:rFonts w:ascii="Times New Roman" w:hAnsi="Times New Roman" w:cs="Times New Roman"/>
+        </w:rPr>
+        <w:t>Implementation of Kalman Filter to predict velocity, from altitudes and using system states.</w:t>
+      </w:r>
+    </w:p>
+    <w:p>
+      <w:pPr>
+        <w:pStyle w:val="ListParagraph"/>
+        <w:rPr>
+          <w:rFonts w:ascii="Times New Roman" w:hAnsi="Times New Roman" w:cs="Times New Roman"/>
+        </w:rPr>
+      </w:pPr>
+    </w:p>
+    <w:p>
+      <w:pPr>
+        <w:pStyle w:val="ListParagraph"/>
+        <w:rPr>
+          <w:rFonts w:ascii="Times New Roman" w:hAnsi="Times New Roman" w:cs="Times New Roman"/>
+        </w:rPr>
+      </w:pPr>
+    </w:p>
+    <w:p>
+      <w:pPr>
+        <w:pStyle w:val="ListParagraph"/>
+        <w:rPr>
+          <w:rFonts w:ascii="Times New Roman" w:hAnsi="Times New Roman" w:cs="Times New Roman"/>
+        </w:rPr>
+      </w:pPr>
+    </w:p>
+    <w:p>
+      <w:pPr>
+        <w:pStyle w:val="ListParagraph"/>
+        <w:rPr>
+          <w:rFonts w:ascii="Times New Roman" w:hAnsi="Times New Roman" w:cs="Times New Roman"/>
+        </w:rPr>
+      </w:pPr>
+    </w:p>
+    <w:p>
+      <w:pPr>
+        <w:pStyle w:val="ListParagraph"/>
+        <w:rPr>
+          <w:rFonts w:ascii="Times New Roman" w:hAnsi="Times New Roman" w:cs="Times New Roman"/>
+        </w:rPr>
+      </w:pPr>
+    </w:p>
+    <w:p>
+      <w:pPr>
+        <w:pStyle w:val="ListParagraph"/>
+        <w:rPr>
+          <w:rFonts w:ascii="Times New Roman" w:hAnsi="Times New Roman" w:cs="Times New Roman"/>
+        </w:rPr>
+      </w:pPr>
+    </w:p>
+    <w:p>
+      <w:pPr>
+        <w:pStyle w:val="ListParagraph"/>
+        <w:rPr>
+          <w:rFonts w:ascii="Times New Roman" w:hAnsi="Times New Roman" w:cs="Times New Roman"/>
+        </w:rPr>
+      </w:pPr>
+    </w:p>
+    <w:p>
+      <w:pPr>
+        <w:pStyle w:val="ListParagraph"/>
+        <w:rPr>
+          <w:rFonts w:ascii="Times New Roman" w:hAnsi="Times New Roman" w:cs="Times New Roman"/>
+        </w:rPr>
+      </w:pPr>
+    </w:p>
+    <w:p>
+      <w:pPr>
+        <w:pStyle w:val="ListParagraph"/>
+        <w:rPr>
+          <w:rFonts w:ascii="Times New Roman" w:hAnsi="Times New Roman" w:cs="Times New Roman"/>
+        </w:rPr>
+      </w:pPr>
+    </w:p>
+    <w:p>
+      <w:pPr>
+        <w:pStyle w:val="ListParagraph"/>
+        <w:rPr>
+          <w:rFonts w:ascii="Times New Roman" w:hAnsi="Times New Roman" w:cs="Times New Roman"/>
+        </w:rPr>
+      </w:pPr>
+    </w:p>
+    <w:p>
+      <w:pPr>
+        <w:pStyle w:val="ListParagraph"/>
+        <w:rPr>
+          <w:rFonts w:ascii="Times New Roman" w:hAnsi="Times New Roman" w:cs="Times New Roman"/>
+        </w:rPr>
+      </w:pPr>
+    </w:p>
+    <w:p>
+      <w:pPr>
+        <w:pStyle w:val="ListParagraph"/>
+        <w:rPr>
+          <w:rFonts w:ascii="Times New Roman" w:hAnsi="Times New Roman" w:cs="Times New Roman"/>
+        </w:rPr>
+      </w:pPr>
+    </w:p>
+    <w:p>
+      <w:pPr>
+        <w:pStyle w:val="ListParagraph"/>
+        <w:rPr>
+          <w:rFonts w:ascii="Times New Roman" w:hAnsi="Times New Roman" w:cs="Times New Roman"/>
+        </w:rPr>
+      </w:pPr>
+    </w:p>
+    <w:p>
+      <w:pPr>
+        <w:pStyle w:val="ListParagraph"/>
+        <w:rPr>
+          <w:rFonts w:ascii="Times New Roman" w:hAnsi="Times New Roman" w:cs="Times New Roman"/>
+        </w:rPr>
+      </w:pPr>
+    </w:p>
+    <w:p>
+      <w:pPr>
+        <w:pStyle w:val="ListParagraph"/>
+        <w:rPr>
+          <w:rFonts w:ascii="Times New Roman" w:hAnsi="Times New Roman" w:cs="Times New Roman"/>
+        </w:rPr>
+      </w:pPr>
+    </w:p>
+    <w:p>
+      <w:pPr>
+        <w:pStyle w:val="ListParagraph"/>
+        <w:rPr>
+          <w:rFonts w:ascii="Times New Roman" w:hAnsi="Times New Roman" w:cs="Times New Roman"/>
+        </w:rPr>
+      </w:pPr>
+    </w:p>
+    <w:p>
+      <w:pPr>
+        <w:pStyle w:val="ListParagraph"/>
+        <w:rPr>
+          <w:rFonts w:ascii="Times New Roman" w:hAnsi="Times New Roman" w:cs="Times New Roman"/>
+        </w:rPr>
+      </w:pPr>
+    </w:p>
+    <w:p>
+      <w:pPr>
+        <w:pStyle w:val="ListParagraph"/>
+        <w:rPr>
+          <w:rFonts w:ascii="Times New Roman" w:hAnsi="Times New Roman" w:cs="Times New Roman"/>
+        </w:rPr>
+      </w:pPr>
+    </w:p>
+    <w:p>
+      <w:pPr>
+        <w:pStyle w:val="ListParagraph"/>
+        <w:rPr>
+          <w:rFonts w:ascii="Times New Roman" w:hAnsi="Times New Roman" w:cs="Times New Roman"/>
+        </w:rPr>
+      </w:pPr>
+    </w:p>
+    <w:p>
+      <w:pPr>
+        <w:pStyle w:val="ListParagraph"/>
+        <w:rPr>
+          <w:rFonts w:ascii="Times New Roman" w:hAnsi="Times New Roman" w:cs="Times New Roman"/>
+        </w:rPr>
+      </w:pPr>
+    </w:p>
+    <w:p>
+      <w:pPr>
+        <w:pStyle w:val="ListParagraph"/>
+        <w:rPr>
+          <w:rFonts w:ascii="Times New Roman" w:hAnsi="Times New Roman" w:cs="Times New Roman"/>
+        </w:rPr>
+      </w:pPr>
+    </w:p>
+    <w:p>
+      <w:pPr>
+        <w:pStyle w:val="ListParagraph"/>
+        <w:rPr>
+          <w:rFonts w:ascii="Times New Roman" w:hAnsi="Times New Roman" w:cs="Times New Roman"/>
+        </w:rPr>
+      </w:pPr>
+    </w:p>
+    <w:p>
+      <w:pPr>
+        <w:pStyle w:val="ListParagraph"/>
+        <w:rPr>
+          <w:rFonts w:ascii="Times New Roman" w:hAnsi="Times New Roman" w:cs="Times New Roman"/>
+        </w:rPr>
+      </w:pPr>
+    </w:p>
+    <w:p>
+      <w:pPr>
+        <w:pStyle w:val="ListParagraph"/>
+        <w:rPr>
+          <w:rFonts w:ascii="Times New Roman" w:hAnsi="Times New Roman" w:cs="Times New Roman"/>
+        </w:rPr>
+      </w:pPr>
+    </w:p>
+    <w:p>
+      <w:pPr>
+        <w:pStyle w:val="ListParagraph"/>
+        <w:rPr>
+          <w:rFonts w:ascii="Times New Roman" w:hAnsi="Times New Roman" w:cs="Times New Roman"/>
+        </w:rPr>
+      </w:pPr>
+    </w:p>
+    <w:p>
+      <w:pPr>
+        <w:pStyle w:val="ListParagraph"/>
+        <w:rPr>
+          <w:rFonts w:ascii="Times New Roman" w:hAnsi="Times New Roman" w:cs="Times New Roman"/>
+        </w:rPr>
+      </w:pPr>
+    </w:p>
+    <w:p>
+      <w:pPr>
+        <w:pStyle w:val="ListParagraph"/>
+        <w:rPr>
+          <w:rFonts w:ascii="Times New Roman" w:hAnsi="Times New Roman" w:cs="Times New Roman"/>
+        </w:rPr>
+      </w:pPr>
+    </w:p>
+    <w:p>
+      <w:pPr>
+        <w:pStyle w:val="ListParagraph"/>
+        <w:rPr>
+          <w:rFonts w:ascii="Times New Roman" w:hAnsi="Times New Roman" w:cs="Times New Roman"/>
+        </w:rPr>
+      </w:pPr>
+    </w:p>
+    <w:p>
+      <w:pPr>
+        <w:pStyle w:val="ListParagraph"/>
+        <w:rPr>
+          <w:rFonts w:ascii="Times New Roman" w:hAnsi="Times New Roman" w:cs="Times New Roman"/>
+        </w:rPr>
+      </w:pPr>
+    </w:p>
+    <w:p>
+      <w:pPr>
+        <w:pStyle w:val="ListParagraph"/>
+        <w:rPr>
+          <w:rFonts w:ascii="Times New Roman" w:hAnsi="Times New Roman" w:cs="Times New Roman"/>
+        </w:rPr>
+      </w:pPr>
+    </w:p>
+    <w:p>
+      <w:pPr>
+        <w:pStyle w:val="Heading2"/>
+        <w:jc w:val="center"/>
+        <w:rPr>
+          <w:rFonts w:ascii="Times New Roman" w:hAnsi="Times New Roman" w:cs="Times New Roman"/>
+        </w:rPr>
+      </w:pPr>
+      <w:r>
+        <w:rPr>
+          <w:rFonts w:ascii="Times New Roman" w:hAnsi="Times New Roman" w:cs="Times New Roman"/>
+        </w:rPr>
+        <w:lastRenderedPageBreak/>
+        <w:t>Kalman Filter</w:t>
+      </w:r>
+    </w:p>
+    <w:p>
+      <w:pPr>
+        <w:rPr>
+          <w:rFonts w:ascii="Times New Roman" w:hAnsi="Times New Roman" w:cs="Times New Roman"/>
+        </w:rPr>
+      </w:pPr>
+      <w:proofErr w:type="gramStart"/>
+      <w:r>
+        <w:rPr>
+          <w:rFonts w:ascii="Times New Roman" w:hAnsi="Times New Roman" w:cs="Times New Roman"/>
+        </w:rPr>
+        <w:t>TL;DR</w:t>
+      </w:r>
+      <w:proofErr w:type="gramEnd"/>
+      <w:r>
+        <w:rPr>
+          <w:rFonts w:ascii="Times New Roman" w:hAnsi="Times New Roman" w:cs="Times New Roman"/>
+        </w:rPr>
+        <w:t xml:space="preserve"> </w:t>
+      </w:r>
+    </w:p>
+    <w:p>
+      <w:pPr>
+        <w:rPr>
+          <w:rFonts w:ascii="Times New Roman" w:hAnsi="Times New Roman" w:cs="Times New Roman"/>
+        </w:rPr>
+      </w:pPr>
+      <w:r>
+        <w:rPr>
+          <w:rFonts w:ascii="Times New Roman" w:hAnsi="Times New Roman" w:cs="Times New Roman"/>
+        </w:rPr>
+        <w:t>Kalman filter is basically a LPF with dynamic alpha. Meaning?</w:t>
+      </w:r>
+    </w:p>
+    <w:p>
+      <w:pPr>
+        <w:rPr>
+          <w:rFonts w:ascii="Times New Roman" w:hAnsi="Times New Roman" w:cs="Times New Roman"/>
+        </w:rPr>
+      </w:pPr>
+      <w:r>
+        <w:rPr>
+          <w:rFonts w:ascii="Times New Roman" w:hAnsi="Times New Roman" w:cs="Times New Roman"/>
+          <w:b/>
+          <w:bCs/>
+        </w:rPr>
+        <w:t>Step 01</w:t>
+      </w:r>
+      <w:r>
+        <w:rPr>
+          <w:rFonts w:ascii="Times New Roman" w:hAnsi="Times New Roman" w:cs="Times New Roman"/>
+        </w:rPr>
+        <w:t>: We initialize our system states (in this case say, position) and a covariance matrix (a diagonal matrix, with variances among the system states at its diagonal, why? [I DON’T KNOW])</w:t>
+      </w:r>
+    </w:p>
+    <w:p>
+      <w:pPr>
+        <w:rPr>
+          <w:rFonts w:ascii="Times New Roman" w:hAnsi="Times New Roman" w:cs="Times New Roman"/>
+        </w:rPr>
+      </w:pPr>
+      <w:r>
+        <w:rPr>
+          <w:rFonts w:ascii="Times New Roman" w:hAnsi="Times New Roman" w:cs="Times New Roman"/>
+          <w:b/>
+          <w:bCs/>
+        </w:rPr>
+        <w:t>Step 02</w:t>
+      </w:r>
+      <w:r>
+        <w:rPr>
+          <w:rFonts w:ascii="Times New Roman" w:hAnsi="Times New Roman" w:cs="Times New Roman"/>
+        </w:rPr>
+        <w:t xml:space="preserve">: We predict the model </w:t>
+      </w:r>
+      <w:proofErr w:type="spellStart"/>
+      <w:r>
+        <w:rPr>
+          <w:rFonts w:ascii="Times New Roman" w:hAnsi="Times New Roman" w:cs="Times New Roman"/>
+        </w:rPr>
+        <w:t>i.e</w:t>
+      </w:r>
+      <w:proofErr w:type="spellEnd"/>
+      <w:r>
+        <w:rPr>
+          <w:rFonts w:ascii="Times New Roman" w:hAnsi="Times New Roman" w:cs="Times New Roman"/>
+        </w:rPr>
+        <w:t xml:space="preserve"> we start with some prediction, </w:t>
+      </w:r>
+      <w:proofErr w:type="gramStart"/>
+      <w:r>
+        <w:rPr>
+          <w:rFonts w:ascii="Times New Roman" w:hAnsi="Times New Roman" w:cs="Times New Roman"/>
+        </w:rPr>
+        <w:t>How</w:t>
+      </w:r>
+      <w:proofErr w:type="gramEnd"/>
+      <w:r>
+        <w:rPr>
+          <w:rFonts w:ascii="Times New Roman" w:hAnsi="Times New Roman" w:cs="Times New Roman"/>
+        </w:rPr>
+        <w:t xml:space="preserve"> do we predict?</w:t>
+      </w:r>
+    </w:p>
+    <w:p>
+      <w:pPr>
+        <w:rPr>
+          <w:rFonts w:ascii="Times New Roman" w:hAnsi="Times New Roman" w:cs="Times New Roman"/>
+        </w:rPr>
+      </w:pPr>
+      <w:r>
+        <w:rPr>
+          <w:rFonts w:ascii="Times New Roman" w:hAnsi="Times New Roman" w:cs="Times New Roman"/>
+        </w:rPr>
+        <w:t xml:space="preserve">Well, there are some model variables </w:t>
+      </w:r>
+      <w:r>
+        <w:rPr>
+          <w:rFonts w:ascii="Times New Roman" w:hAnsi="Times New Roman" w:cs="Times New Roman"/>
+          <w:i/>
+          <w:iCs/>
+        </w:rPr>
+        <w:t xml:space="preserve">(model variables are either noise that we assume, the error rate etc) </w:t>
+      </w:r>
+      <w:r>
+        <w:rPr>
+          <w:rFonts w:ascii="Times New Roman" w:hAnsi="Times New Roman" w:cs="Times New Roman"/>
+        </w:rPr>
+        <w:t>usually these are represented as: A, R, Q, H (all these variables are vectors/matrices)</w:t>
+      </w:r>
+    </w:p>
+    <w:p>
+      <w:pPr>
+        <w:rPr>
+          <w:rFonts w:ascii="Times New Roman" w:hAnsi="Times New Roman" w:cs="Times New Roman"/>
+        </w:rPr>
+      </w:pPr>
+      <w:r>
+        <w:rPr>
+          <w:rFonts w:ascii="Times New Roman" w:hAnsi="Times New Roman" w:cs="Times New Roman"/>
+        </w:rPr>
+        <w:t>A: A State to transition matrix, one can say, it is some sort of “rule matrix” that governs how a particular state is transitioned over a period of time.</w:t>
+      </w:r>
+    </w:p>
+    <w:p>
+      <w:pPr>
+        <w:rPr>
+          <w:rFonts w:ascii="Times New Roman" w:hAnsi="Times New Roman" w:cs="Times New Roman"/>
+        </w:rPr>
+      </w:pPr>
+      <w:r>
+        <w:rPr>
+          <w:rFonts w:ascii="Times New Roman" w:hAnsi="Times New Roman" w:cs="Times New Roman"/>
+        </w:rPr>
+        <w:t xml:space="preserve">R: </w:t>
+      </w:r>
+      <w:r>
+        <w:rPr>
+          <w:rFonts w:ascii="Times New Roman" w:hAnsi="Times New Roman" w:cs="Times New Roman"/>
+        </w:rPr>
+        <w:t>It is the noise level in the system, easy language? – Tells the model, how much to trust the sensor readings. More R, Less trust on sensor</w:t>
+      </w:r>
+    </w:p>
+    <w:p>
+      <w:pPr>
+        <w:rPr>
+          <w:rFonts w:ascii="Times New Roman" w:hAnsi="Times New Roman" w:cs="Times New Roman"/>
+        </w:rPr>
+      </w:pPr>
+      <w:r>
+        <w:rPr>
+          <w:rFonts w:ascii="Times New Roman" w:hAnsi="Times New Roman" w:cs="Times New Roman"/>
+        </w:rPr>
+        <w:t xml:space="preserve">Q: This is the process </w:t>
+      </w:r>
+      <w:proofErr w:type="gramStart"/>
+      <w:r>
+        <w:rPr>
+          <w:rFonts w:ascii="Times New Roman" w:hAnsi="Times New Roman" w:cs="Times New Roman"/>
+        </w:rPr>
+        <w:t>noise,</w:t>
+      </w:r>
+      <w:proofErr w:type="gramEnd"/>
+      <w:r>
+        <w:rPr>
+          <w:rFonts w:ascii="Times New Roman" w:hAnsi="Times New Roman" w:cs="Times New Roman"/>
+        </w:rPr>
+        <w:t xml:space="preserve"> it depicts the noise in the readings.</w:t>
+      </w:r>
+    </w:p>
+    <w:p>
+      <w:pPr>
+        <w:rPr>
+          <w:rFonts w:ascii="Times New Roman" w:hAnsi="Times New Roman" w:cs="Times New Roman"/>
+        </w:rPr>
+      </w:pPr>
+      <w:r>
+        <w:rPr>
+          <w:rFonts w:ascii="Times New Roman" w:hAnsi="Times New Roman" w:cs="Times New Roman"/>
+        </w:rPr>
+        <w:t xml:space="preserve">H: This is the measurement </w:t>
+      </w:r>
+      <w:proofErr w:type="gramStart"/>
+      <w:r>
+        <w:rPr>
+          <w:rFonts w:ascii="Times New Roman" w:hAnsi="Times New Roman" w:cs="Times New Roman"/>
+        </w:rPr>
+        <w:t>noise,</w:t>
+      </w:r>
+      <w:proofErr w:type="gramEnd"/>
+      <w:r>
+        <w:rPr>
+          <w:rFonts w:ascii="Times New Roman" w:hAnsi="Times New Roman" w:cs="Times New Roman"/>
+        </w:rPr>
+        <w:t xml:space="preserve"> it tells how much noise to consider in the measurement of a reading.</w:t>
+      </w:r>
+    </w:p>
+    <w:p>
+      <w:pPr>
+        <w:rPr>
+          <w:rFonts w:ascii="Times New Roman" w:hAnsi="Times New Roman" w:cs="Times New Roman"/>
+        </w:rPr>
+      </w:pPr>
+      <w:r>
+        <w:rPr>
+          <w:rFonts w:ascii="Times New Roman" w:hAnsi="Times New Roman" w:cs="Times New Roman"/>
+          <w:b/>
+          <w:bCs/>
+        </w:rPr>
+        <w:t xml:space="preserve">Step 03: </w:t>
+      </w:r>
+      <w:r>
+        <w:rPr>
+          <w:rFonts w:ascii="Times New Roman" w:hAnsi="Times New Roman" w:cs="Times New Roman"/>
+        </w:rPr>
+        <w:t xml:space="preserve">We then compute something called Kalman </w:t>
+      </w:r>
+      <w:proofErr w:type="gramStart"/>
+      <w:r>
+        <w:rPr>
+          <w:rFonts w:ascii="Times New Roman" w:hAnsi="Times New Roman" w:cs="Times New Roman"/>
+        </w:rPr>
+        <w:t>Gain,</w:t>
+      </w:r>
+      <w:proofErr w:type="gramEnd"/>
+      <w:r>
+        <w:rPr>
+          <w:rFonts w:ascii="Times New Roman" w:hAnsi="Times New Roman" w:cs="Times New Roman"/>
+        </w:rPr>
+        <w:t xml:space="preserve"> this is the main thing that makes the model improve over the period of time and improve its estimation.</w:t>
+      </w:r>
+    </w:p>
+    <w:p>
+      <w:pPr>
+        <w:rPr>
+          <w:rFonts w:ascii="Times New Roman" w:hAnsi="Times New Roman" w:cs="Times New Roman"/>
+        </w:rPr>
+      </w:pPr>
+      <w:r>
+        <w:rPr>
+          <w:rFonts w:ascii="Times New Roman" w:hAnsi="Times New Roman" w:cs="Times New Roman"/>
+          <w:b/>
+          <w:bCs/>
+        </w:rPr>
+        <w:t xml:space="preserve">Step 04: </w:t>
+      </w:r>
+      <w:r>
+        <w:rPr>
+          <w:rFonts w:ascii="Times New Roman" w:hAnsi="Times New Roman" w:cs="Times New Roman"/>
+        </w:rPr>
+        <w:t>And at last, we compute the covariance matrix again, since we started with an assumption and in the first run, our covariance matrix (P) tells us how confident we are with our current readings, so with new readings, we of course need to shrink/reduce the matrix because now we have actual readings for 2</w:t>
+      </w:r>
+      <w:r>
+        <w:rPr>
+          <w:rFonts w:ascii="Times New Roman" w:hAnsi="Times New Roman" w:cs="Times New Roman"/>
+          <w:vertAlign w:val="superscript"/>
+        </w:rPr>
+        <w:t>nd</w:t>
+      </w:r>
+      <w:r>
+        <w:rPr>
+          <w:rFonts w:ascii="Times New Roman" w:hAnsi="Times New Roman" w:cs="Times New Roman"/>
+        </w:rPr>
+        <w:t xml:space="preserve"> run.</w:t>
+      </w:r>
+    </w:p>
+    <w:p>
+      <w:pPr>
+        <w:rPr>
+          <w:rFonts w:ascii="Times New Roman" w:hAnsi="Times New Roman" w:cs="Times New Roman"/>
+        </w:rPr>
+      </w:pPr>
+      <w:r>
+        <w:rPr>
+          <w:rFonts w:ascii="Times New Roman" w:hAnsi="Times New Roman" w:cs="Times New Roman"/>
+        </w:rPr>
+        <w:t>This continues…….</w:t>
+      </w:r>
+    </w:p>
+    <w:p>
+      <w:pPr>
+        <w:rPr>
+          <w:rFonts w:ascii="Times New Roman" w:hAnsi="Times New Roman" w:cs="Times New Roman"/>
+        </w:rPr>
+      </w:pPr>
+      <w:r>
+        <w:rPr>
+          <w:noProof/>
+        </w:rPr>
+        <w:drawing>
+          <wp:inline distT="0" distB="0" distL="0" distR="0" wp14:anchorId="091E07D7" wp14:editId="39CA6EEB">
+            <wp:extent cx="3090362" cy="3649133"/>
+            <wp:effectExtent l="0" t="0" r="0" b="8890"/>
+            <wp:docPr id="824762710" name="Picture 1"/>
+            <wp:cNvGraphicFramePr>
+              <a:graphicFrameLocks xmlns:a="http://schemas.openxmlformats.org/drawingml/2006/main" noChangeAspect="1"/>
+            </wp:cNvGraphicFramePr>
+            <a:graphic xmlns:a="http://schemas.openxmlformats.org/drawingml/2006/main">
+              <a:graphicData uri="http://schemas.openxmlformats.org/drawingml/2006/picture">
+                <pic:pic xmlns:pic="http://schemas.openxmlformats.org/drawingml/2006/picture">
+                  <pic:nvPicPr>
+                    <pic:cNvPr id="824762710" name=""/>
+                    <pic:cNvPicPr/>
+                  </pic:nvPicPr>
+                  <pic:blipFill>
+                    <a:blip r:embed="rId27"/>
+                    <a:stretch>
+                      <a:fillRect/>
+                    </a:stretch>
+                  </pic:blipFill>
+                  <pic:spPr>
+                    <a:xfrm>
+                      <a:off x="0" y="0"/>
+                      <a:ext cx="3111435" cy="3674016"/>
+                    </a:xfrm>
+                    <a:prstGeom prst="rect">
+                      <a:avLst/>
+                    </a:prstGeom>
+                  </pic:spPr>
+                </pic:pic>
+              </a:graphicData>
+            </a:graphic>
+          </wp:inline>
+        </w:drawing>
+      </w:r>
+    </w:p>
+    <w:p>
+      <w:pPr>
+        <w:rPr>
+          <w:rFonts w:ascii="Times New Roman" w:hAnsi="Times New Roman" w:cs="Times New Roman"/>
+        </w:rPr>
+      </w:pPr>
+      <w:r>
+        <w:rPr>
+          <w:rFonts w:ascii="Times New Roman" w:hAnsi="Times New Roman" w:cs="Times New Roman"/>
+        </w:rPr>
+        <w:lastRenderedPageBreak/>
+        <w:t>But the question still remains, what does Kalman filter do?</w:t>
+      </w:r>
+    </w:p>
+    <w:p>
+      <w:pPr>
+        <w:pStyle w:val="NoSpacing"/>
+      </w:pPr>
+      <w:r>
+        <w:t>In short, it filters out the noise from the readings/signals and also helps us to estimate some unknown variable (say velocity) from a known variable (</w:t>
+      </w:r>
+      <w:proofErr w:type="spellStart"/>
+      <w:r>
+        <w:t>Eg.</w:t>
+      </w:r>
+      <w:proofErr w:type="spellEnd"/>
+      <w:r>
+        <w:t xml:space="preserve"> Position) without even needing to calculate it.</w:t>
+      </w:r>
+    </w:p>
+    <w:p>
+      <w:pPr>
+        <w:pStyle w:val="NoSpacing"/>
+      </w:pPr>
+      <w:r>
+        <w:t>Yes, traditional method of taking derivative of position w.r.t time remains the same, it is just that Kalman filter is more optimized way to doing the same thing, with a view to reduce the delay in the readings and removing noise at the same time.</w:t>
+      </w:r>
+    </w:p>
+    <w:p>
+      <w:pPr>
+        <w:pStyle w:val="NoSpacing"/>
+      </w:pPr>
+      <w:r>
+        <w:t>How do we calculate velocity, provided we are given only altitudes and a sensor rate?</w:t>
+      </w:r>
+    </w:p>
+    <w:p>
+      <w:pPr>
+        <w:pStyle w:val="NoSpacing"/>
+      </w:pPr>
+      <w:r>
+        <w:t xml:space="preserve">Yes, </w:t>
+      </w:r>
+      <w:r>
+        <w:t>a</w:t>
+      </w:r>
+      <w:r>
+        <w:t>gain the answer is same, we take time derivative of position, but will that work? No, because the position’s readings will itself have</w:t>
+      </w:r>
+      <w:r>
+        <w:t xml:space="preserve"> noise. There comes in Kalman filter, smooths out the readings estimates the velocity, and outputs position, velocity together.</w:t>
+      </w:r>
+    </w:p>
+    <w:p>
+      <w:pPr>
+        <w:pStyle w:val="NoSpacing"/>
+      </w:pPr>
+    </w:p>
+    <w:p>
+      <w:pPr>
+        <w:pStyle w:val="NoSpacing"/>
+      </w:pPr>
+      <w:r>
+        <w:drawing>
+          <wp:inline distT="0" distB="0" distL="0" distR="0" wp14:anchorId="4AC64FB9" wp14:editId="2C02F509">
+            <wp:extent cx="5314950" cy="6501482"/>
+            <wp:effectExtent l="0" t="0" r="0" b="0"/>
+            <wp:docPr id="235194738" name="Picture 1"/>
+            <wp:cNvGraphicFramePr>
+              <a:graphicFrameLocks xmlns:a="http://schemas.openxmlformats.org/drawingml/2006/main" noChangeAspect="1"/>
+            </wp:cNvGraphicFramePr>
+            <a:graphic xmlns:a="http://schemas.openxmlformats.org/drawingml/2006/main">
+              <a:graphicData uri="http://schemas.openxmlformats.org/drawingml/2006/picture">
+                <pic:pic xmlns:pic="http://schemas.openxmlformats.org/drawingml/2006/picture">
+                  <pic:nvPicPr>
+                    <pic:cNvPr id="235194738" name=""/>
+                    <pic:cNvPicPr/>
+                  </pic:nvPicPr>
+                  <pic:blipFill>
+                    <a:blip r:embed="rId28"/>
+                    <a:stretch>
+                      <a:fillRect/>
+                    </a:stretch>
+                  </pic:blipFill>
+                  <pic:spPr>
+                    <a:xfrm>
+                      <a:off x="0" y="0"/>
+                      <a:ext cx="5334545" cy="6525451"/>
+                    </a:xfrm>
+                    <a:prstGeom prst="rect">
+                      <a:avLst/>
+                    </a:prstGeom>
+                  </pic:spPr>
+                </pic:pic>
+              </a:graphicData>
+            </a:graphic>
+          </wp:inline>
+        </w:drawing>
+      </w:r>
+    </w:p>
+    <w:p>
+      <w:pPr>
+        <w:rPr>
+          <w:rFonts w:ascii="Times New Roman" w:hAnsi="Times New Roman" w:cs="Times New Roman"/>
+        </w:rPr>
+      </w:pPr>
+    </w:p>
+    <w:p>
+      <w:pPr>
+        <w:rPr>
+          <w:rFonts w:ascii="Times New Roman" w:hAnsi="Times New Roman" w:cs="Times New Roman"/>
+          <w:b/>
+          <w:bCs/>
+          <w:i/>
+          <w:iCs/>
+        </w:rPr>
+      </w:pPr>
+      <w:r>
+        <w:rPr>
+          <w:rFonts w:ascii="Times New Roman" w:hAnsi="Times New Roman" w:cs="Times New Roman"/>
+          <w:b/>
+          <w:bCs/>
+          <w:i/>
+          <w:iCs/>
+        </w:rPr>
+        <w:lastRenderedPageBreak/>
+        <w:t>*For results, the assumptions remain the same</w:t>
+      </w:r>
+    </w:p>
+    <w:p>
+      <w:pPr>
+        <w:rPr>
+          <w:rFonts w:ascii="Times New Roman" w:eastAsiaTheme="minorEastAsia" w:hAnsi="Times New Roman" w:cs="Times New Roman"/>
+        </w:rPr>
+      </w:pPr>
+      <w:r>
+        <w:rPr>
+          <w:rFonts w:ascii="Times New Roman" w:hAnsi="Times New Roman" w:cs="Times New Roman"/>
+        </w:rPr>
+        <w:t xml:space="preserve">A. </w:t>
+      </w:r>
+      <m:oMath>
+        <m:r>
+          <w:rPr>
+            <w:rFonts w:ascii="Cambria Math" w:hAnsi="Cambria Math" w:cs="Times New Roman"/>
+          </w:rPr>
+          <m:t>σ=10</m:t>
+        </m:r>
+      </m:oMath>
+      <w:r>
+        <w:rPr>
+          <w:rFonts w:ascii="Times New Roman" w:eastAsiaTheme="minorEastAsia" w:hAnsi="Times New Roman" w:cs="Times New Roman"/>
+        </w:rPr>
+        <w:t xml:space="preserve"> @ 10 Hz</w:t>
+      </w:r>
+    </w:p>
+    <w:p>
+      <w:pPr>
+        <w:rPr>
+          <w:rFonts w:ascii="Times New Roman" w:hAnsi="Times New Roman" w:cs="Times New Roman"/>
+        </w:rPr>
+      </w:pPr>
+      <w:r>
+        <w:rPr>
+          <w:rFonts w:ascii="Times New Roman" w:hAnsi="Times New Roman" w:cs="Times New Roman"/>
+          <w:noProof/>
+        </w:rPr>
+        <w:drawing>
+          <wp:inline distT="0" distB="0" distL="0" distR="0" wp14:anchorId="4BF24229" wp14:editId="4F696037">
+            <wp:extent cx="4222829" cy="5067300"/>
+            <wp:effectExtent l="0" t="0" r="6350" b="0"/>
+            <wp:docPr id="2078479614" name="Picture 1"/>
+            <wp:cNvGraphicFramePr>
+              <a:graphicFrameLocks xmlns:a="http://schemas.openxmlformats.org/drawingml/2006/main" noChangeAspect="1"/>
+            </wp:cNvGraphicFramePr>
+            <a:graphic xmlns:a="http://schemas.openxmlformats.org/drawingml/2006/main">
+              <a:graphicData uri="http://schemas.openxmlformats.org/drawingml/2006/picture">
+                <pic:pic xmlns:pic="http://schemas.openxmlformats.org/drawingml/2006/picture">
+                  <pic:nvPicPr>
+                    <pic:cNvPr id="0" name="Picture 1"/>
+                    <pic:cNvPicPr>
+                      <a:picLocks noChangeAspect="1" noChangeArrowheads="1"/>
+                    </pic:cNvPicPr>
+                  </pic:nvPicPr>
+                  <pic:blipFill>
+                    <a:blip r:embed="rId29" cstate="print">
+                      <a:extLst>
+                        <a:ext uri="{28A0092B-C50C-407E-A947-70E740481C1C}">
+                          <a14:useLocalDpi xmlns:a14="http://schemas.microsoft.com/office/drawing/2010/main" val="0"/>
+                        </a:ext>
+                      </a:extLst>
+                    </a:blip>
+                    <a:srcRect/>
+                    <a:stretch>
+                      <a:fillRect/>
+                    </a:stretch>
+                  </pic:blipFill>
+                  <pic:spPr bwMode="auto">
+                    <a:xfrm>
+                      <a:off x="0" y="0"/>
+                      <a:ext cx="4233623" cy="5080253"/>
+                    </a:xfrm>
+                    <a:prstGeom prst="rect">
+                      <a:avLst/>
+                    </a:prstGeom>
+                    <a:noFill/>
+                    <a:ln>
+                      <a:noFill/>
+                    </a:ln>
+                  </pic:spPr>
+                </pic:pic>
+              </a:graphicData>
+            </a:graphic>
+          </wp:inline>
+        </w:drawing>
+      </w:r>
+    </w:p>
+    <w:p>
+      <w:pPr>
+        <w:rPr>
+          <w:rFonts w:ascii="Times New Roman" w:hAnsi="Times New Roman" w:cs="Times New Roman"/>
+        </w:rPr>
+      </w:pPr>
+      <w:r>
+        <w:rPr>
+          <w:rFonts w:ascii="Times New Roman" w:hAnsi="Times New Roman" w:cs="Times New Roman"/>
+        </w:rPr>
+        <w:t>Velocity:</w:t>
+      </w:r>
+    </w:p>
+    <w:p>
+      <w:pPr>
+        <w:rPr>
+          <w:rFonts w:ascii="Times New Roman" w:hAnsi="Times New Roman" w:cs="Times New Roman"/>
+        </w:rPr>
+      </w:pPr>
+      <w:r>
+        <w:rPr>
+          <w:rFonts w:ascii="Times New Roman" w:hAnsi="Times New Roman" w:cs="Times New Roman"/>
+          <w:noProof/>
+        </w:rPr>
+        <w:drawing>
+          <wp:inline distT="0" distB="0" distL="0" distR="0" wp14:anchorId="2788A97C" wp14:editId="7FDFFFE8">
+            <wp:extent cx="4787900" cy="2659710"/>
+            <wp:effectExtent l="0" t="0" r="0" b="7620"/>
+            <wp:docPr id="2069768465" name="Picture 2"/>
+            <wp:cNvGraphicFramePr>
+              <a:graphicFrameLocks xmlns:a="http://schemas.openxmlformats.org/drawingml/2006/main" noChangeAspect="1"/>
+            </wp:cNvGraphicFramePr>
+            <a:graphic xmlns:a="http://schemas.openxmlformats.org/drawingml/2006/main">
+              <a:graphicData uri="http://schemas.openxmlformats.org/drawingml/2006/picture">
+                <pic:pic xmlns:pic="http://schemas.openxmlformats.org/drawingml/2006/picture">
+                  <pic:nvPicPr>
+                    <pic:cNvPr id="0" name="Picture 2"/>
+                    <pic:cNvPicPr>
+                      <a:picLocks noChangeAspect="1" noChangeArrowheads="1"/>
+                    </pic:cNvPicPr>
+                  </pic:nvPicPr>
+                  <pic:blipFill>
+                    <a:blip r:embed="rId30" cstate="print">
+                      <a:extLst>
+                        <a:ext uri="{28A0092B-C50C-407E-A947-70E740481C1C}">
+                          <a14:useLocalDpi xmlns:a14="http://schemas.microsoft.com/office/drawing/2010/main" val="0"/>
+                        </a:ext>
+                      </a:extLst>
+                    </a:blip>
+                    <a:srcRect/>
+                    <a:stretch>
+                      <a:fillRect/>
+                    </a:stretch>
+                  </pic:blipFill>
+                  <pic:spPr bwMode="auto">
+                    <a:xfrm>
+                      <a:off x="0" y="0"/>
+                      <a:ext cx="4825357" cy="2680518"/>
+                    </a:xfrm>
+                    <a:prstGeom prst="rect">
+                      <a:avLst/>
+                    </a:prstGeom>
+                    <a:noFill/>
+                    <a:ln>
+                      <a:noFill/>
+                    </a:ln>
+                  </pic:spPr>
+                </pic:pic>
+              </a:graphicData>
+            </a:graphic>
+          </wp:inline>
+        </w:drawing>
+      </w:r>
+    </w:p>
+    <w:p>
+      <w:pPr>
+        <w:rPr>
+          <w:rFonts w:ascii="Times New Roman" w:hAnsi="Times New Roman" w:cs="Times New Roman"/>
+        </w:rPr>
+      </w:pPr>
+      <w:r>
+        <w:rPr>
+          <w:rFonts w:ascii="Times New Roman" w:hAnsi="Times New Roman" w:cs="Times New Roman"/>
+        </w:rPr>
+        <w:lastRenderedPageBreak/>
+        <w:t>@50 Hz:</w:t>
+      </w:r>
+    </w:p>
+    <w:p>
+      <w:pPr>
+        <w:rPr>
+          <w:rFonts w:ascii="Times New Roman" w:hAnsi="Times New Roman" w:cs="Times New Roman"/>
+        </w:rPr>
+      </w:pPr>
+      <w:r>
+        <w:rPr>
+          <w:rFonts w:ascii="Times New Roman" w:hAnsi="Times New Roman" w:cs="Times New Roman"/>
+          <w:noProof/>
+        </w:rPr>
+        <w:drawing>
+          <wp:inline distT="0" distB="0" distL="0" distR="0" wp14:anchorId="3AFDC024" wp14:editId="37BA446E">
+            <wp:extent cx="4254579" cy="5105400"/>
+            <wp:effectExtent l="0" t="0" r="0" b="0"/>
+            <wp:docPr id="1039798217" name="Picture 3"/>
+            <wp:cNvGraphicFramePr>
+              <a:graphicFrameLocks xmlns:a="http://schemas.openxmlformats.org/drawingml/2006/main" noChangeAspect="1"/>
+            </wp:cNvGraphicFramePr>
+            <a:graphic xmlns:a="http://schemas.openxmlformats.org/drawingml/2006/main">
+              <a:graphicData uri="http://schemas.openxmlformats.org/drawingml/2006/picture">
+                <pic:pic xmlns:pic="http://schemas.openxmlformats.org/drawingml/2006/picture">
+                  <pic:nvPicPr>
+                    <pic:cNvPr id="0" name="Picture 3"/>
+                    <pic:cNvPicPr>
+                      <a:picLocks noChangeAspect="1" noChangeArrowheads="1"/>
+                    </pic:cNvPicPr>
+                  </pic:nvPicPr>
+                  <pic:blipFill>
+                    <a:blip r:embed="rId31" cstate="print">
+                      <a:extLst>
+                        <a:ext uri="{28A0092B-C50C-407E-A947-70E740481C1C}">
+                          <a14:useLocalDpi xmlns:a14="http://schemas.microsoft.com/office/drawing/2010/main" val="0"/>
+                        </a:ext>
+                      </a:extLst>
+                    </a:blip>
+                    <a:srcRect/>
+                    <a:stretch>
+                      <a:fillRect/>
+                    </a:stretch>
+                  </pic:blipFill>
+                  <pic:spPr bwMode="auto">
+                    <a:xfrm>
+                      <a:off x="0" y="0"/>
+                      <a:ext cx="4256229" cy="5107380"/>
+                    </a:xfrm>
+                    <a:prstGeom prst="rect">
+                      <a:avLst/>
+                    </a:prstGeom>
+                    <a:noFill/>
+                    <a:ln>
+                      <a:noFill/>
+                    </a:ln>
+                  </pic:spPr>
+                </pic:pic>
+              </a:graphicData>
+            </a:graphic>
+          </wp:inline>
+        </w:drawing>
+      </w:r>
+    </w:p>
+    <w:p>
+      <w:pPr>
+        <w:rPr>
+          <w:rFonts w:ascii="Times New Roman" w:hAnsi="Times New Roman" w:cs="Times New Roman"/>
+        </w:rPr>
+      </w:pPr>
+      <w:r>
+        <w:rPr>
+          <w:rFonts w:ascii="Times New Roman" w:hAnsi="Times New Roman" w:cs="Times New Roman"/>
+        </w:rPr>
+        <w:t>Velocity</w:t>
+      </w:r>
+    </w:p>
+    <w:p>
+      <w:pPr>
+        <w:rPr>
+          <w:rFonts w:ascii="Times New Roman" w:hAnsi="Times New Roman" w:cs="Times New Roman"/>
+        </w:rPr>
+      </w:pPr>
+      <w:r>
+        <w:rPr>
+          <w:rFonts w:ascii="Times New Roman" w:hAnsi="Times New Roman" w:cs="Times New Roman"/>
+          <w:noProof/>
+        </w:rPr>
+        <w:drawing>
+          <wp:inline distT="0" distB="0" distL="0" distR="0" wp14:anchorId="3A994DCC" wp14:editId="21EDB80B">
+            <wp:extent cx="4170034" cy="2316480"/>
+            <wp:effectExtent l="0" t="0" r="2540" b="7620"/>
+            <wp:docPr id="271018599" name="Picture 4"/>
+            <wp:cNvGraphicFramePr>
+              <a:graphicFrameLocks xmlns:a="http://schemas.openxmlformats.org/drawingml/2006/main" noChangeAspect="1"/>
+            </wp:cNvGraphicFramePr>
+            <a:graphic xmlns:a="http://schemas.openxmlformats.org/drawingml/2006/main">
+              <a:graphicData uri="http://schemas.openxmlformats.org/drawingml/2006/picture">
+                <pic:pic xmlns:pic="http://schemas.openxmlformats.org/drawingml/2006/picture">
+                  <pic:nvPicPr>
+                    <pic:cNvPr id="0" name="Picture 4"/>
+                    <pic:cNvPicPr>
+                      <a:picLocks noChangeAspect="1" noChangeArrowheads="1"/>
+                    </pic:cNvPicPr>
+                  </pic:nvPicPr>
+                  <pic:blipFill>
+                    <a:blip r:embed="rId32" cstate="print">
+                      <a:extLst>
+                        <a:ext uri="{28A0092B-C50C-407E-A947-70E740481C1C}">
+                          <a14:useLocalDpi xmlns:a14="http://schemas.microsoft.com/office/drawing/2010/main" val="0"/>
+                        </a:ext>
+                      </a:extLst>
+                    </a:blip>
+                    <a:srcRect/>
+                    <a:stretch>
+                      <a:fillRect/>
+                    </a:stretch>
+                  </pic:blipFill>
+                  <pic:spPr bwMode="auto">
+                    <a:xfrm>
+                      <a:off x="0" y="0"/>
+                      <a:ext cx="4177966" cy="2320886"/>
+                    </a:xfrm>
+                    <a:prstGeom prst="rect">
+                      <a:avLst/>
+                    </a:prstGeom>
+                    <a:noFill/>
+                    <a:ln>
+                      <a:noFill/>
+                    </a:ln>
+                  </pic:spPr>
+                </pic:pic>
+              </a:graphicData>
+            </a:graphic>
+          </wp:inline>
+        </w:drawing>
+      </w:r>
+    </w:p>
+    <w:p>
+      <w:pPr>
+        <w:rPr>
+          <w:rFonts w:ascii="Times New Roman" w:hAnsi="Times New Roman" w:cs="Times New Roman"/>
+        </w:rPr>
+      </w:pPr>
+    </w:p>
+    <w:p>
+      <w:pPr>
+        <w:rPr>
+          <w:rFonts w:ascii="Times New Roman" w:hAnsi="Times New Roman" w:cs="Times New Roman"/>
+        </w:rPr>
+      </w:pPr>
+    </w:p>
+    <w:p>
+      <w:pPr>
+        <w:rPr>
+          <w:rFonts w:ascii="Times New Roman" w:hAnsi="Times New Roman" w:cs="Times New Roman"/>
+        </w:rPr>
+      </w:pPr>
+      <w:r>
+        <w:rPr>
+          <w:rFonts w:ascii="Times New Roman" w:hAnsi="Times New Roman" w:cs="Times New Roman"/>
+        </w:rPr>
+        <w:lastRenderedPageBreak/>
+        <w:t>@ 100 Hz</w:t>
+      </w:r>
+    </w:p>
+    <w:p>
+      <w:pPr>
+        <w:rPr>
+          <w:rFonts w:ascii="Times New Roman" w:hAnsi="Times New Roman" w:cs="Times New Roman"/>
+        </w:rPr>
+      </w:pPr>
+      <w:r>
+        <w:rPr>
+          <w:rFonts w:ascii="Times New Roman" w:hAnsi="Times New Roman" w:cs="Times New Roman"/>
+          <w:noProof/>
+        </w:rPr>
+        <w:drawing>
+          <wp:inline distT="0" distB="0" distL="0" distR="0" wp14:anchorId="47D104A1" wp14:editId="42285FBD">
+            <wp:extent cx="4457782" cy="5349240"/>
+            <wp:effectExtent l="0" t="0" r="0" b="3810"/>
+            <wp:docPr id="572649525" name="Picture 5"/>
+            <wp:cNvGraphicFramePr>
+              <a:graphicFrameLocks xmlns:a="http://schemas.openxmlformats.org/drawingml/2006/main" noChangeAspect="1"/>
+            </wp:cNvGraphicFramePr>
+            <a:graphic xmlns:a="http://schemas.openxmlformats.org/drawingml/2006/main">
+              <a:graphicData uri="http://schemas.openxmlformats.org/drawingml/2006/picture">
+                <pic:pic xmlns:pic="http://schemas.openxmlformats.org/drawingml/2006/picture">
+                  <pic:nvPicPr>
+                    <pic:cNvPr id="0" name="Picture 5"/>
+                    <pic:cNvPicPr>
+                      <a:picLocks noChangeAspect="1" noChangeArrowheads="1"/>
+                    </pic:cNvPicPr>
+                  </pic:nvPicPr>
+                  <pic:blipFill>
+                    <a:blip r:embed="rId33" cstate="print">
+                      <a:extLst>
+                        <a:ext uri="{28A0092B-C50C-407E-A947-70E740481C1C}">
+                          <a14:useLocalDpi xmlns:a14="http://schemas.microsoft.com/office/drawing/2010/main" val="0"/>
+                        </a:ext>
+                      </a:extLst>
+                    </a:blip>
+                    <a:srcRect/>
+                    <a:stretch>
+                      <a:fillRect/>
+                    </a:stretch>
+                  </pic:blipFill>
+                  <pic:spPr bwMode="auto">
+                    <a:xfrm>
+                      <a:off x="0" y="0"/>
+                      <a:ext cx="4459180" cy="5350918"/>
+                    </a:xfrm>
+                    <a:prstGeom prst="rect">
+                      <a:avLst/>
+                    </a:prstGeom>
+                    <a:noFill/>
+                    <a:ln>
+                      <a:noFill/>
+                    </a:ln>
+                  </pic:spPr>
+                </pic:pic>
+              </a:graphicData>
+            </a:graphic>
+          </wp:inline>
+        </w:drawing>
+      </w:r>
+    </w:p>
+    <w:p>
+      <w:pPr>
+        <w:rPr>
+          <w:rFonts w:ascii="Times New Roman" w:hAnsi="Times New Roman" w:cs="Times New Roman"/>
+        </w:rPr>
+      </w:pPr>
+      <w:r>
+        <w:rPr>
+          <w:rFonts w:ascii="Times New Roman" w:hAnsi="Times New Roman" w:cs="Times New Roman"/>
+          <w:noProof/>
+        </w:rPr>
+        <w:drawing>
+          <wp:inline distT="0" distB="0" distL="0" distR="0" wp14:anchorId="0630D7FA" wp14:editId="6F73A25B">
+            <wp:extent cx="4252337" cy="2362200"/>
+            <wp:effectExtent l="0" t="0" r="0" b="0"/>
+            <wp:docPr id="1277572128" name="Picture 6"/>
+            <wp:cNvGraphicFramePr>
+              <a:graphicFrameLocks xmlns:a="http://schemas.openxmlformats.org/drawingml/2006/main" noChangeAspect="1"/>
+            </wp:cNvGraphicFramePr>
+            <a:graphic xmlns:a="http://schemas.openxmlformats.org/drawingml/2006/main">
+              <a:graphicData uri="http://schemas.openxmlformats.org/drawingml/2006/picture">
+                <pic:pic xmlns:pic="http://schemas.openxmlformats.org/drawingml/2006/picture">
+                  <pic:nvPicPr>
+                    <pic:cNvPr id="0" name="Picture 6"/>
+                    <pic:cNvPicPr>
+                      <a:picLocks noChangeAspect="1" noChangeArrowheads="1"/>
+                    </pic:cNvPicPr>
+                  </pic:nvPicPr>
+                  <pic:blipFill>
+                    <a:blip r:embed="rId34" cstate="print">
+                      <a:extLst>
+                        <a:ext uri="{28A0092B-C50C-407E-A947-70E740481C1C}">
+                          <a14:useLocalDpi xmlns:a14="http://schemas.microsoft.com/office/drawing/2010/main" val="0"/>
+                        </a:ext>
+                      </a:extLst>
+                    </a:blip>
+                    <a:srcRect/>
+                    <a:stretch>
+                      <a:fillRect/>
+                    </a:stretch>
+                  </pic:blipFill>
+                  <pic:spPr bwMode="auto">
+                    <a:xfrm>
+                      <a:off x="0" y="0"/>
+                      <a:ext cx="4259161" cy="2365991"/>
+                    </a:xfrm>
+                    <a:prstGeom prst="rect">
+                      <a:avLst/>
+                    </a:prstGeom>
+                    <a:noFill/>
+                    <a:ln>
+                      <a:noFill/>
+                    </a:ln>
+                  </pic:spPr>
+                </pic:pic>
+              </a:graphicData>
+            </a:graphic>
+          </wp:inline>
+        </w:drawing>
+      </w:r>
+    </w:p>
+    <w:p>
+      <w:pPr>
+        <w:rPr>
+          <w:rFonts w:ascii="Times New Roman" w:hAnsi="Times New Roman" w:cs="Times New Roman"/>
+        </w:rPr>
+      </w:pPr>
+      <w:r>
+        <w:rPr>
+          <w:rFonts w:ascii="Times New Roman" w:hAnsi="Times New Roman" w:cs="Times New Roman"/>
+          <w:b/>
+          <w:bCs/>
+        </w:rPr>
+        <w:t xml:space="preserve">Conclusion: </w:t>
+      </w:r>
+      <w:r>
+        <w:rPr>
+          <w:rFonts w:ascii="Times New Roman" w:hAnsi="Times New Roman" w:cs="Times New Roman"/>
+        </w:rPr>
+        <w:t xml:space="preserve">As we can see for all the middle graph, velocity has spikes at low frequencies, but as we increase the sampling rate it smooths better. Now, it can even get smoother if we tune the Model variables. In next plots, Q and R have been tuned. A and </w:t>
+      </w:r>
+      <w:proofErr w:type="spellStart"/>
+      <w:r>
+        <w:rPr>
+          <w:rFonts w:ascii="Times New Roman" w:hAnsi="Times New Roman" w:cs="Times New Roman"/>
+        </w:rPr>
+        <w:t>H are</w:t>
+      </w:r>
+      <w:proofErr w:type="spellEnd"/>
+      <w:r>
+        <w:rPr>
+          <w:rFonts w:ascii="Times New Roman" w:hAnsi="Times New Roman" w:cs="Times New Roman"/>
+        </w:rPr>
+        <w:t xml:space="preserve"> same.</w:t>
+      </w:r>
+    </w:p>
+    <w:p>
+      <w:pPr>
+        <w:rPr>
+          <w:rFonts w:ascii="Times New Roman" w:hAnsi="Times New Roman" w:cs="Times New Roman"/>
+        </w:rPr>
+      </w:pPr>
+      <w:r>
+        <w:rPr>
+          <w:rFonts w:ascii="Times New Roman" w:hAnsi="Times New Roman" w:cs="Times New Roman"/>
+        </w:rPr>
+        <w:lastRenderedPageBreak/>
+        <w:t>Smoothed out @ 100Hz</w:t>
+      </w:r>
+    </w:p>
+    <w:p>
+      <w:pPr>
+        <w:rPr>
+          <w:rFonts w:ascii="Times New Roman" w:hAnsi="Times New Roman" w:cs="Times New Roman"/>
+        </w:rPr>
+      </w:pPr>
+      <w:r>
+        <w:rPr>
+          <w:rFonts w:ascii="Times New Roman" w:hAnsi="Times New Roman" w:cs="Times New Roman"/>
+          <w:noProof/>
+        </w:rPr>
+        <w:drawing>
+          <wp:inline distT="0" distB="0" distL="0" distR="0" wp14:anchorId="17A993A4" wp14:editId="37AC7E3C">
+            <wp:extent cx="3643745" cy="4372413"/>
+            <wp:effectExtent l="0" t="0" r="0" b="9525"/>
+            <wp:docPr id="91976635" name="Picture 7"/>
+            <wp:cNvGraphicFramePr>
+              <a:graphicFrameLocks xmlns:a="http://schemas.openxmlformats.org/drawingml/2006/main" noChangeAspect="1"/>
+            </wp:cNvGraphicFramePr>
+            <a:graphic xmlns:a="http://schemas.openxmlformats.org/drawingml/2006/main">
+              <a:graphicData uri="http://schemas.openxmlformats.org/drawingml/2006/picture">
+                <pic:pic xmlns:pic="http://schemas.openxmlformats.org/drawingml/2006/picture">
+                  <pic:nvPicPr>
+                    <pic:cNvPr id="0" name="Picture 7"/>
+                    <pic:cNvPicPr>
+                      <a:picLocks noChangeAspect="1" noChangeArrowheads="1"/>
+                    </pic:cNvPicPr>
+                  </pic:nvPicPr>
+                  <pic:blipFill>
+                    <a:blip r:embed="rId35" cstate="print">
+                      <a:extLst>
+                        <a:ext uri="{28A0092B-C50C-407E-A947-70E740481C1C}">
+                          <a14:useLocalDpi xmlns:a14="http://schemas.microsoft.com/office/drawing/2010/main" val="0"/>
+                        </a:ext>
+                      </a:extLst>
+                    </a:blip>
+                    <a:srcRect/>
+                    <a:stretch>
+                      <a:fillRect/>
+                    </a:stretch>
+                  </pic:blipFill>
+                  <pic:spPr bwMode="auto">
+                    <a:xfrm>
+                      <a:off x="0" y="0"/>
+                      <a:ext cx="3649722" cy="4379586"/>
+                    </a:xfrm>
+                    <a:prstGeom prst="rect">
+                      <a:avLst/>
+                    </a:prstGeom>
+                    <a:noFill/>
+                    <a:ln>
+                      <a:noFill/>
+                    </a:ln>
+                  </pic:spPr>
+                </pic:pic>
+              </a:graphicData>
+            </a:graphic>
+          </wp:inline>
+        </w:drawing>
+      </w:r>
+    </w:p>
+    <w:p>
+      <w:pPr>
+        <w:rPr>
+          <w:rFonts w:ascii="Times New Roman" w:hAnsi="Times New Roman" w:cs="Times New Roman"/>
+        </w:rPr>
+      </w:pPr>
+      <w:r>
+        <w:rPr>
+          <w:rFonts w:ascii="Times New Roman" w:hAnsi="Times New Roman" w:cs="Times New Roman"/>
+          <w:noProof/>
+        </w:rPr>
+        <w:drawing>
+          <wp:inline distT="0" distB="0" distL="0" distR="0" wp14:anchorId="11031E2C" wp14:editId="11A6663A">
+            <wp:extent cx="3484418" cy="1935616"/>
+            <wp:effectExtent l="0" t="0" r="1905" b="7620"/>
+            <wp:docPr id="2135030970" name="Picture 8"/>
+            <wp:cNvGraphicFramePr>
+              <a:graphicFrameLocks xmlns:a="http://schemas.openxmlformats.org/drawingml/2006/main" noChangeAspect="1"/>
+            </wp:cNvGraphicFramePr>
+            <a:graphic xmlns:a="http://schemas.openxmlformats.org/drawingml/2006/main">
+              <a:graphicData uri="http://schemas.openxmlformats.org/drawingml/2006/picture">
+                <pic:pic xmlns:pic="http://schemas.openxmlformats.org/drawingml/2006/picture">
+                  <pic:nvPicPr>
+                    <pic:cNvPr id="0" name="Picture 8"/>
+                    <pic:cNvPicPr>
+                      <a:picLocks noChangeAspect="1" noChangeArrowheads="1"/>
+                    </pic:cNvPicPr>
+                  </pic:nvPicPr>
+                  <pic:blipFill>
+                    <a:blip r:embed="rId36" cstate="print">
+                      <a:extLst>
+                        <a:ext uri="{28A0092B-C50C-407E-A947-70E740481C1C}">
+                          <a14:useLocalDpi xmlns:a14="http://schemas.microsoft.com/office/drawing/2010/main" val="0"/>
+                        </a:ext>
+                      </a:extLst>
+                    </a:blip>
+                    <a:srcRect/>
+                    <a:stretch>
+                      <a:fillRect/>
+                    </a:stretch>
+                  </pic:blipFill>
+                  <pic:spPr bwMode="auto">
+                    <a:xfrm>
+                      <a:off x="0" y="0"/>
+                      <a:ext cx="3507879" cy="1948649"/>
+                    </a:xfrm>
+                    <a:prstGeom prst="rect">
+                      <a:avLst/>
+                    </a:prstGeom>
+                    <a:noFill/>
+                    <a:ln>
+                      <a:noFill/>
+                    </a:ln>
+                  </pic:spPr>
+                </pic:pic>
+              </a:graphicData>
+            </a:graphic>
+          </wp:inline>
+        </w:drawing>
+      </w:r>
+    </w:p>
+    <w:p>
+      <w:pPr>
+        <w:rPr>
+          <w:rFonts w:ascii="Times New Roman" w:hAnsi="Times New Roman" w:cs="Times New Roman"/>
+        </w:rPr>
+      </w:pPr>
+    </w:p>
+    <w:p>
+      <w:pPr>
+        <w:rPr>
+          <w:rFonts w:ascii="Times New Roman" w:hAnsi="Times New Roman" w:cs="Times New Roman"/>
+        </w:rPr>
+      </w:pPr>
+      <w:r>
+        <w:rPr>
+          <w:rFonts w:ascii="Times New Roman" w:hAnsi="Times New Roman" w:cs="Times New Roman"/>
+        </w:rPr>
+        <w:t>The performs is improved, the estimation of velocity is far</w:t>
+      </w:r>
+      <w:r>
+        <w:rPr>
+          <w:rFonts w:ascii="Times New Roman" w:hAnsi="Times New Roman" w:cs="Times New Roman"/>
+        </w:rPr>
+        <w:t xml:space="preserve"> </w:t>
+      </w:r>
+      <w:r>
+        <w:rPr>
+          <w:rFonts w:ascii="Times New Roman" w:hAnsi="Times New Roman" w:cs="Times New Roman"/>
+        </w:rPr>
+        <w:t xml:space="preserve">smoother than previous observation at 100 Hz, by tuning the Q and R matrices, this effect is observed even at low sampling rate </w:t>
+      </w:r>
+      <w:proofErr w:type="spellStart"/>
+      <w:r>
+        <w:rPr>
+          <w:rFonts w:ascii="Times New Roman" w:hAnsi="Times New Roman" w:cs="Times New Roman"/>
+        </w:rPr>
+        <w:t>ie</w:t>
+      </w:r>
+      <w:proofErr w:type="spellEnd"/>
+      <w:r>
+        <w:rPr>
+          <w:rFonts w:ascii="Times New Roman" w:hAnsi="Times New Roman" w:cs="Times New Roman"/>
+        </w:rPr>
+        <w:t xml:space="preserve"> @ 10Hz.</w:t>
+      </w:r>
+    </w:p>
+    <w:p>
+      <w:pPr>
+        <w:rPr>
+          <w:rFonts w:ascii="Times New Roman" w:hAnsi="Times New Roman" w:cs="Times New Roman"/>
+        </w:rPr>
+      </w:pPr>
+    </w:p>
+    <w:p>
+      <w:pPr>
+        <w:rPr>
+          <w:rFonts w:ascii="Times New Roman" w:hAnsi="Times New Roman" w:cs="Times New Roman"/>
+        </w:rPr>
+      </w:pPr>
+    </w:p>
+    <w:p>
+      <w:pPr>
+        <w:rPr>
+          <w:rFonts w:ascii="Times New Roman" w:hAnsi="Times New Roman" w:cs="Times New Roman"/>
+        </w:rPr>
+      </w:pPr>
+    </w:p>
+    <w:p>
+      <w:pPr>
+        <w:rPr>
+          <w:rFonts w:ascii="Times New Roman" w:hAnsi="Times New Roman" w:cs="Times New Roman"/>
+        </w:rPr>
+      </w:pPr>
+    </w:p>
+    <w:p>
+      <w:pPr>
+        <w:rPr>
+          <w:rFonts w:ascii="Times New Roman" w:hAnsi="Times New Roman" w:cs="Times New Roman"/>
+        </w:rPr>
+      </w:pPr>
+    </w:p>
+    <w:p>
+      <w:pPr>
+        <w:rPr>
+          <w:rFonts w:ascii="Times New Roman" w:hAnsi="Times New Roman" w:cs="Times New Roman"/>
+        </w:rPr>
+      </w:pPr>
+    </w:p>
+    <w:p>
+      <w:pPr>
+        <w:rPr>
+          <w:rFonts w:ascii="Times New Roman" w:hAnsi="Times New Roman" w:cs="Times New Roman"/>
+        </w:rPr>
+      </w:pPr>
+      <w:r>
+        <w:rPr>
+          <w:rFonts w:ascii="Times New Roman" w:hAnsi="Times New Roman" w:cs="Times New Roman"/>
+        </w:rPr>
+        <w:t>Smoothed Out @ 10Hz.</w:t>
+      </w:r>
+    </w:p>
+    <w:p>
+      <w:pPr>
+        <w:rPr>
+          <w:rFonts w:ascii="Times New Roman" w:hAnsi="Times New Roman" w:cs="Times New Roman"/>
+        </w:rPr>
+      </w:pPr>
+      <w:r>
+        <w:rPr>
+          <w:rFonts w:ascii="Times New Roman" w:hAnsi="Times New Roman" w:cs="Times New Roman"/>
+          <w:noProof/>
+        </w:rPr>
+        <w:drawing>
+          <wp:inline distT="0" distB="0" distL="0" distR="0" wp14:anchorId="59C0BD1A" wp14:editId="5965E0D1">
+            <wp:extent cx="4191077" cy="5029200"/>
+            <wp:effectExtent l="0" t="0" r="0" b="0"/>
+            <wp:docPr id="34847371" name="Picture 9"/>
+            <wp:cNvGraphicFramePr>
+              <a:graphicFrameLocks xmlns:a="http://schemas.openxmlformats.org/drawingml/2006/main" noChangeAspect="1"/>
+            </wp:cNvGraphicFramePr>
+            <a:graphic xmlns:a="http://schemas.openxmlformats.org/drawingml/2006/main">
+              <a:graphicData uri="http://schemas.openxmlformats.org/drawingml/2006/picture">
+                <pic:pic xmlns:pic="http://schemas.openxmlformats.org/drawingml/2006/picture">
+                  <pic:nvPicPr>
+                    <pic:cNvPr id="0" name="Picture 9"/>
+                    <pic:cNvPicPr>
+                      <a:picLocks noChangeAspect="1" noChangeArrowheads="1"/>
+                    </pic:cNvPicPr>
+                  </pic:nvPicPr>
+                  <pic:blipFill>
+                    <a:blip r:embed="rId37" cstate="print">
+                      <a:extLst>
+                        <a:ext uri="{28A0092B-C50C-407E-A947-70E740481C1C}">
+                          <a14:useLocalDpi xmlns:a14="http://schemas.microsoft.com/office/drawing/2010/main" val="0"/>
+                        </a:ext>
+                      </a:extLst>
+                    </a:blip>
+                    <a:srcRect/>
+                    <a:stretch>
+                      <a:fillRect/>
+                    </a:stretch>
+                  </pic:blipFill>
+                  <pic:spPr bwMode="auto">
+                    <a:xfrm>
+                      <a:off x="0" y="0"/>
+                      <a:ext cx="4194823" cy="5033695"/>
+                    </a:xfrm>
+                    <a:prstGeom prst="rect">
+                      <a:avLst/>
+                    </a:prstGeom>
+                    <a:noFill/>
+                    <a:ln>
+                      <a:noFill/>
+                    </a:ln>
+                  </pic:spPr>
+                </pic:pic>
+              </a:graphicData>
+            </a:graphic>
+          </wp:inline>
+        </w:drawing>
+      </w:r>
+    </w:p>
+    <w:p>
+      <w:pPr>
+        <w:rPr>
+          <w:rFonts w:ascii="Times New Roman" w:hAnsi="Times New Roman" w:cs="Times New Roman"/>
+        </w:rPr>
+      </w:pPr>
+      <w:r>
+        <w:rPr>
+          <w:rFonts w:ascii="Times New Roman" w:hAnsi="Times New Roman" w:cs="Times New Roman"/>
+          <w:noProof/>
+        </w:rPr>
+        <w:drawing>
+          <wp:inline distT="0" distB="0" distL="0" distR="0" wp14:anchorId="7F161848" wp14:editId="72559C9B">
+            <wp:extent cx="4046579" cy="2247900"/>
+            <wp:effectExtent l="0" t="0" r="0" b="0"/>
+            <wp:docPr id="434545882" name="Picture 10"/>
+            <wp:cNvGraphicFramePr>
+              <a:graphicFrameLocks xmlns:a="http://schemas.openxmlformats.org/drawingml/2006/main" noChangeAspect="1"/>
+            </wp:cNvGraphicFramePr>
+            <a:graphic xmlns:a="http://schemas.openxmlformats.org/drawingml/2006/main">
+              <a:graphicData uri="http://schemas.openxmlformats.org/drawingml/2006/picture">
+                <pic:pic xmlns:pic="http://schemas.openxmlformats.org/drawingml/2006/picture">
+                  <pic:nvPicPr>
+                    <pic:cNvPr id="0" name="Picture 10"/>
+                    <pic:cNvPicPr>
+                      <a:picLocks noChangeAspect="1" noChangeArrowheads="1"/>
+                    </pic:cNvPicPr>
+                  </pic:nvPicPr>
+                  <pic:blipFill>
+                    <a:blip r:embed="rId38" cstate="print">
+                      <a:extLst>
+                        <a:ext uri="{28A0092B-C50C-407E-A947-70E740481C1C}">
+                          <a14:useLocalDpi xmlns:a14="http://schemas.microsoft.com/office/drawing/2010/main" val="0"/>
+                        </a:ext>
+                      </a:extLst>
+                    </a:blip>
+                    <a:srcRect/>
+                    <a:stretch>
+                      <a:fillRect/>
+                    </a:stretch>
+                  </pic:blipFill>
+                  <pic:spPr bwMode="auto">
+                    <a:xfrm>
+                      <a:off x="0" y="0"/>
+                      <a:ext cx="4053401" cy="2251689"/>
+                    </a:xfrm>
+                    <a:prstGeom prst="rect">
+                      <a:avLst/>
+                    </a:prstGeom>
+                    <a:noFill/>
+                    <a:ln>
+                      <a:noFill/>
+                    </a:ln>
+                  </pic:spPr>
+                </pic:pic>
+              </a:graphicData>
+            </a:graphic>
+          </wp:inline>
+        </w:drawing>
+      </w:r>
+    </w:p>
+    <w:p>
+      <w:pPr>
+        <w:rPr>
+          <w:rFonts w:ascii="Times New Roman" w:hAnsi="Times New Roman" w:cs="Times New Roman"/>
+        </w:rPr>
+      </w:pPr>
+      <w:r>
+        <w:rPr>
+          <w:rFonts w:ascii="Times New Roman" w:hAnsi="Times New Roman" w:cs="Times New Roman"/>
+        </w:rPr>
+        <w:t xml:space="preserve">Now, here if we carefully, see and compare the prev. 10 Hz plots and this one, </w:t>
+      </w:r>
+      <w:proofErr w:type="spellStart"/>
+      <w:r>
+        <w:rPr>
+          <w:rFonts w:ascii="Times New Roman" w:hAnsi="Times New Roman" w:cs="Times New Roman"/>
+        </w:rPr>
+        <w:t>obv</w:t>
+      </w:r>
+      <w:proofErr w:type="spellEnd"/>
+      <w:r>
+        <w:rPr>
+          <w:rFonts w:ascii="Times New Roman" w:hAnsi="Times New Roman" w:cs="Times New Roman"/>
+        </w:rPr>
+        <w:t xml:space="preserve">. This one is better but if we compare this 10 Hz with our tuned 100 Hz. </w:t>
+      </w:r>
+    </w:p>
+    <w:p>
+      <w:pPr>
+        <w:rPr>
+          <w:rFonts w:ascii="Times New Roman" w:hAnsi="Times New Roman" w:cs="Times New Roman"/>
+        </w:rPr>
+      </w:pPr>
+      <w:r>
+        <w:rPr>
+          <w:rFonts w:ascii="Times New Roman" w:hAnsi="Times New Roman" w:cs="Times New Roman"/>
+        </w:rPr>
+        <w:t>100 Hz sampling gives best results among all the observations.</w:t>
+      </w:r>
+    </w:p>
+    <w:p>
+      <w:pPr>
+        <w:rPr>
+          <w:rFonts w:ascii="Times New Roman" w:hAnsi="Times New Roman" w:cs="Times New Roman"/>
+        </w:rPr>
+      </w:pPr>
+      <w:r>
+        <w:rPr>
+          <w:rFonts w:ascii="Times New Roman" w:hAnsi="Times New Roman" w:cs="Times New Roman"/>
+        </w:rPr>
+        <w:lastRenderedPageBreak/>
+        <w:t xml:space="preserve">So, we have seen how Kalman filter is used to remove noise and estimate a system variable without actually measuring it. (We can even estimate, Altitudes and Velocity using Accelerometer and </w:t>
+      </w:r>
+      <w:proofErr w:type="spellStart"/>
+      <w:r>
+        <w:rPr>
+          <w:rFonts w:ascii="Times New Roman" w:hAnsi="Times New Roman" w:cs="Times New Roman"/>
+        </w:rPr>
+        <w:t>Gyrometer</w:t>
+      </w:r>
+      <w:proofErr w:type="spellEnd"/>
+      <w:r>
+        <w:rPr>
+          <w:rFonts w:ascii="Times New Roman" w:hAnsi="Times New Roman" w:cs="Times New Roman"/>
+        </w:rPr>
+        <w:t xml:space="preserve"> data)</w:t>
+      </w:r>
+    </w:p>
+    <w:p>
+      <w:pPr>
+        <w:rPr>
+          <w:rFonts w:ascii="Times New Roman" w:hAnsi="Times New Roman" w:cs="Times New Roman"/>
+        </w:rPr>
+      </w:pPr>
+      <w:r>
+        <w:rPr>
+          <w:rFonts w:ascii="Times New Roman" w:hAnsi="Times New Roman" w:cs="Times New Roman"/>
+        </w:rPr>
+        <w:t>Applications are vast: Signal Processing, Navigation, Image processing etc.</w:t>
+      </w:r>
+    </w:p>
+    <w:p>
+      <w:pPr>
+        <w:rPr>
+          <w:rFonts w:ascii="Times New Roman" w:hAnsi="Times New Roman" w:cs="Times New Roman"/>
+        </w:rPr>
+      </w:pPr>
+      <w:r>
+        <w:rPr>
+          <w:rFonts w:ascii="Times New Roman" w:hAnsi="Times New Roman" w:cs="Times New Roman"/>
+        </w:rPr>
+        <w:t xml:space="preserve">@100 Hz, </w:t>
+      </w:r>
+      <m:oMath>
+        <m:r>
+          <w:rPr>
+            <w:rFonts w:ascii="Cambria Math" w:hAnsi="Cambria Math" w:cs="Times New Roman"/>
+          </w:rPr>
+          <m:t>σ=10</m:t>
+        </m:r>
+      </m:oMath>
+      <w:r>
+        <w:rPr>
+          <w:rFonts w:ascii="Times New Roman" w:hAnsi="Times New Roman" w:cs="Times New Roman"/>
+        </w:rPr>
+        <w:t>:</w:t>
+      </w:r>
+    </w:p>
+    <w:p>
+      <w:pPr>
+        <w:rPr>
+          <w:rFonts w:ascii="Times New Roman" w:eastAsiaTheme="minorEastAsia" w:hAnsi="Times New Roman" w:cs="Times New Roman"/>
+        </w:rPr>
+      </w:pPr>
+      <m:oMath>
+        <m:r>
+          <w:rPr>
+            <w:rFonts w:ascii="Cambria Math" w:hAnsi="Cambria Math" w:cs="Times New Roman"/>
+          </w:rPr>
+          <m:t>A=(</m:t>
+        </m:r>
+        <m:m>
+          <m:mPr>
+            <m:mcs>
+              <m:mc>
+                <m:mcPr>
+                  <m:count m:val="2"/>
+                  <m:mcJc m:val="center"/>
+                </m:mcPr>
+              </m:mc>
+            </m:mcs>
+            <m:ctrlPr>
+              <w:rPr>
+                <w:rFonts w:ascii="Cambria Math" w:hAnsi="Cambria Math" w:cs="Times New Roman"/>
+                <w:i/>
+              </w:rPr>
+            </m:ctrlPr>
+          </m:mPr>
+          <m:mr>
+            <m:e>
+              <m:r>
+                <w:rPr>
+                  <w:rFonts w:ascii="Cambria Math" w:hAnsi="Cambria Math" w:cs="Times New Roman"/>
+                </w:rPr>
+                <m:t>1</m:t>
+              </m:r>
+            </m:e>
+            <m:e>
+              <m:r>
+                <w:rPr>
+                  <w:rFonts w:ascii="Cambria Math" w:hAnsi="Cambria Math" w:cs="Times New Roman"/>
+                </w:rPr>
+                <m:t>dT</m:t>
+              </m:r>
+            </m:e>
+          </m:mr>
+          <m:mr>
+            <m:e>
+              <m:r>
+                <w:rPr>
+                  <w:rFonts w:ascii="Cambria Math" w:hAnsi="Cambria Math" w:cs="Times New Roman"/>
+                </w:rPr>
+                <m:t>0</m:t>
+              </m:r>
+            </m:e>
+            <m:e>
+              <m:r>
+                <w:rPr>
+                  <w:rFonts w:ascii="Cambria Math" w:hAnsi="Cambria Math" w:cs="Times New Roman"/>
+                </w:rPr>
+                <m:t>1</m:t>
+              </m:r>
+            </m:e>
+          </m:mr>
+        </m:m>
+        <m:r>
+          <w:rPr>
+            <w:rFonts w:ascii="Cambria Math" w:hAnsi="Cambria Math" w:cs="Times New Roman"/>
+          </w:rPr>
+          <m:t>)</m:t>
+        </m:r>
+      </m:oMath>
+      <w:r>
+        <w:rPr>
+          <w:rFonts w:ascii="Times New Roman" w:eastAsiaTheme="minorEastAsia" w:hAnsi="Times New Roman" w:cs="Times New Roman"/>
+        </w:rPr>
+        <w:t xml:space="preserve">,  </w:t>
+      </w:r>
+      <m:oMath>
+        <m:r>
+          <w:rPr>
+            <w:rFonts w:ascii="Cambria Math" w:hAnsi="Cambria Math" w:cs="Times New Roman"/>
+          </w:rPr>
+          <m:t>Q=(</m:t>
+        </m:r>
+        <m:m>
+          <m:mPr>
+            <m:mcs>
+              <m:mc>
+                <m:mcPr>
+                  <m:count m:val="2"/>
+                  <m:mcJc m:val="center"/>
+                </m:mcPr>
+              </m:mc>
+            </m:mcs>
+            <m:ctrlPr>
+              <w:rPr>
+                <w:rFonts w:ascii="Cambria Math" w:hAnsi="Cambria Math" w:cs="Times New Roman"/>
+                <w:i/>
+              </w:rPr>
+            </m:ctrlPr>
+          </m:mPr>
+          <m:mr>
+            <m:e>
+              <m:r>
+                <w:rPr>
+                  <w:rFonts w:ascii="Cambria Math" w:hAnsi="Cambria Math" w:cs="Times New Roman"/>
+                </w:rPr>
+                <m:t>0.1</m:t>
+              </m:r>
+            </m:e>
+            <m:e>
+              <m:r>
+                <w:rPr>
+                  <w:rFonts w:ascii="Cambria Math" w:hAnsi="Cambria Math" w:cs="Times New Roman"/>
+                </w:rPr>
+                <m:t>0</m:t>
+              </m:r>
+            </m:e>
+          </m:mr>
+          <m:mr>
+            <m:e>
+              <m:r>
+                <w:rPr>
+                  <w:rFonts w:ascii="Cambria Math" w:hAnsi="Cambria Math" w:cs="Times New Roman"/>
+                </w:rPr>
+                <m:t>0</m:t>
+              </m:r>
+            </m:e>
+            <m:e>
+              <m:r>
+                <w:rPr>
+                  <w:rFonts w:ascii="Cambria Math" w:hAnsi="Cambria Math" w:cs="Times New Roman"/>
+                </w:rPr>
+                <m:t>0.1</m:t>
+              </m:r>
+            </m:e>
+          </m:mr>
+        </m:m>
+        <m:r>
+          <w:rPr>
+            <w:rFonts w:ascii="Cambria Math" w:hAnsi="Cambria Math" w:cs="Times New Roman"/>
+          </w:rPr>
+          <m:t>)</m:t>
+        </m:r>
+      </m:oMath>
+      <w:r>
+        <w:rPr>
+          <w:rFonts w:ascii="Times New Roman" w:eastAsiaTheme="minorEastAsia" w:hAnsi="Times New Roman" w:cs="Times New Roman"/>
+        </w:rPr>
+        <w:t xml:space="preserve">,  </w:t>
+      </w:r>
+      <m:oMath>
+        <m:r>
+          <w:rPr>
+            <w:rFonts w:ascii="Cambria Math" w:hAnsi="Cambria Math" w:cs="Times New Roman"/>
+          </w:rPr>
+          <m:t>H=(1     0)</m:t>
+        </m:r>
+      </m:oMath>
+      <w:r>
+        <w:rPr>
+          <w:rFonts w:ascii="Times New Roman" w:eastAsiaTheme="minorEastAsia" w:hAnsi="Times New Roman" w:cs="Times New Roman"/>
+        </w:rPr>
+        <w:t xml:space="preserve">, </w:t>
+      </w:r>
+      <m:oMath>
+        <m:r>
+          <w:rPr>
+            <w:rFonts w:ascii="Cambria Math" w:hAnsi="Cambria Math" w:cs="Times New Roman"/>
+          </w:rPr>
+          <m:t>R=(100)</m:t>
+        </m:r>
+      </m:oMath>
+      <w:r>
+        <w:rPr>
+          <w:rFonts w:ascii="Times New Roman" w:eastAsiaTheme="minorEastAsia" w:hAnsi="Times New Roman" w:cs="Times New Roman"/>
+        </w:rPr>
+        <w:t xml:space="preserve">, </w:t>
+      </w:r>
+      <m:oMath>
+        <m:r>
+          <w:rPr>
+            <w:rFonts w:ascii="Cambria Math" w:hAnsi="Cambria Math" w:cs="Times New Roman"/>
+          </w:rPr>
+          <m:t>P=500*(</m:t>
+        </m:r>
+        <m:m>
+          <m:mPr>
+            <m:mcs>
+              <m:mc>
+                <m:mcPr>
+                  <m:count m:val="2"/>
+                  <m:mcJc m:val="center"/>
+                </m:mcPr>
+              </m:mc>
+            </m:mcs>
+            <m:ctrlPr>
+              <w:rPr>
+                <w:rFonts w:ascii="Cambria Math" w:hAnsi="Cambria Math" w:cs="Times New Roman"/>
+                <w:i/>
+              </w:rPr>
+            </m:ctrlPr>
+          </m:mPr>
+          <m:mr>
+            <m:e>
+              <m:r>
+                <w:rPr>
+                  <w:rFonts w:ascii="Cambria Math" w:hAnsi="Cambria Math" w:cs="Times New Roman"/>
+                </w:rPr>
+                <m:t>1</m:t>
+              </m:r>
+            </m:e>
+            <m:e>
+              <m:r>
+                <w:rPr>
+                  <w:rFonts w:ascii="Cambria Math" w:hAnsi="Cambria Math" w:cs="Times New Roman"/>
+                </w:rPr>
+                <m:t>0</m:t>
+              </m:r>
+            </m:e>
+          </m:mr>
+          <m:mr>
+            <m:e>
+              <m:r>
+                <w:rPr>
+                  <w:rFonts w:ascii="Cambria Math" w:hAnsi="Cambria Math" w:cs="Times New Roman"/>
+                </w:rPr>
+                <m:t>0</m:t>
+              </m:r>
+            </m:e>
+            <m:e>
+              <m:r>
+                <w:rPr>
+                  <w:rFonts w:ascii="Cambria Math" w:hAnsi="Cambria Math" w:cs="Times New Roman"/>
+                </w:rPr>
+                <m:t>1</m:t>
+              </m:r>
+            </m:e>
+          </m:mr>
+        </m:m>
+        <m:r>
+          <w:rPr>
+            <w:rFonts w:ascii="Cambria Math" w:hAnsi="Cambria Math" w:cs="Times New Roman"/>
+          </w:rPr>
+          <m:t>)</m:t>
+        </m:r>
+      </m:oMath>
     </w:p>
     <w:sectPr>
       <w:pgSz w:w="11906" w:h="16838"/>
@@ -1351,6 +4472,95 @@
     </w:lvl>
   </w:abstractNum>
   <w:abstractNum w:abstractNumId="1" w15:restartNumberingAfterBreak="0">
+    <w:nsid w:val="355539E7"/>
+    <w:multiLevelType w:val="hybridMultilevel"/>
+    <w:tmpl w:val="E7DED2C0"/>
+    <w:lvl w:ilvl="0" w:tplc="40090015">
+      <w:start w:val="1"/>
+      <w:numFmt w:val="upperLetter"/>
+      <w:lvlText w:val="%1."/>
+      <w:lvlJc w:val="left"/>
+      <w:pPr>
+        <w:ind w:left="720" w:hanging="360"/>
+      </w:pPr>
+      <w:rPr>
+        <w:rFonts w:hint="default"/>
+      </w:rPr>
+    </w:lvl>
+    <w:lvl w:ilvl="1" w:tplc="40090019" w:tentative="1">
+      <w:start w:val="1"/>
+      <w:numFmt w:val="lowerLetter"/>
+      <w:lvlText w:val="%2."/>
+      <w:lvlJc w:val="left"/>
+      <w:pPr>
+        <w:ind w:left="1440" w:hanging="360"/>
+      </w:pPr>
+    </w:lvl>
+    <w:lvl w:ilvl="2" w:tplc="4009001B" w:tentative="1">
+      <w:start w:val="1"/>
+      <w:numFmt w:val="lowerRoman"/>
+      <w:lvlText w:val="%3."/>
+      <w:lvlJc w:val="right"/>
+      <w:pPr>
+        <w:ind w:left="2160" w:hanging="180"/>
+      </w:pPr>
+    </w:lvl>
+    <w:lvl w:ilvl="3" w:tplc="4009000F" w:tentative="1">
+      <w:start w:val="1"/>
+      <w:numFmt w:val="decimal"/>
+      <w:lvlText w:val="%4."/>
+      <w:lvlJc w:val="left"/>
+      <w:pPr>
+        <w:ind w:left="2880" w:hanging="360"/>
+      </w:pPr>
+    </w:lvl>
+    <w:lvl w:ilvl="4" w:tplc="40090019" w:tentative="1">
+      <w:start w:val="1"/>
+      <w:numFmt w:val="lowerLetter"/>
+      <w:lvlText w:val="%5."/>
+      <w:lvlJc w:val="left"/>
+      <w:pPr>
+        <w:ind w:left="3600" w:hanging="360"/>
+      </w:pPr>
+    </w:lvl>
+    <w:lvl w:ilvl="5" w:tplc="4009001B" w:tentative="1">
+      <w:start w:val="1"/>
+      <w:numFmt w:val="lowerRoman"/>
+      <w:lvlText w:val="%6."/>
+      <w:lvlJc w:val="right"/>
+      <w:pPr>
+        <w:ind w:left="4320" w:hanging="180"/>
+      </w:pPr>
+    </w:lvl>
+    <w:lvl w:ilvl="6" w:tplc="4009000F" w:tentative="1">
+      <w:start w:val="1"/>
+      <w:numFmt w:val="decimal"/>
+      <w:lvlText w:val="%7."/>
+      <w:lvlJc w:val="left"/>
+      <w:pPr>
+        <w:ind w:left="5040" w:hanging="360"/>
+      </w:pPr>
+    </w:lvl>
+    <w:lvl w:ilvl="7" w:tplc="40090019" w:tentative="1">
+      <w:start w:val="1"/>
+      <w:numFmt w:val="lowerLetter"/>
+      <w:lvlText w:val="%8."/>
+      <w:lvlJc w:val="left"/>
+      <w:pPr>
+        <w:ind w:left="5760" w:hanging="360"/>
+      </w:pPr>
+    </w:lvl>
+    <w:lvl w:ilvl="8" w:tplc="4009001B" w:tentative="1">
+      <w:start w:val="1"/>
+      <w:numFmt w:val="lowerRoman"/>
+      <w:lvlText w:val="%9."/>
+      <w:lvlJc w:val="right"/>
+      <w:pPr>
+        <w:ind w:left="6480" w:hanging="180"/>
+      </w:pPr>
+    </w:lvl>
+  </w:abstractNum>
+  <w:abstractNum w:abstractNumId="2" w15:restartNumberingAfterBreak="0">
     <w:nsid w:val="3823460C"/>
     <w:multiLevelType w:val="hybridMultilevel"/>
     <w:tmpl w:val="281619A8"/>
@@ -1440,7 +4650,7 @@
       </w:pPr>
     </w:lvl>
   </w:abstractNum>
-  <w:abstractNum w:abstractNumId="2" w15:restartNumberingAfterBreak="0">
+  <w:abstractNum w:abstractNumId="3" w15:restartNumberingAfterBreak="0">
     <w:nsid w:val="3B5742FC"/>
     <w:multiLevelType w:val="hybridMultilevel"/>
     <w:tmpl w:val="F9F27B8A"/>
@@ -1529,7 +4739,7 @@
       </w:pPr>
     </w:lvl>
   </w:abstractNum>
-  <w:abstractNum w:abstractNumId="3" w15:restartNumberingAfterBreak="0">
+  <w:abstractNum w:abstractNumId="4" w15:restartNumberingAfterBreak="0">
     <w:nsid w:val="56B80EB8"/>
     <w:multiLevelType w:val="hybridMultilevel"/>
     <w:tmpl w:val="0F72CF1A"/>
@@ -1618,16 +4828,113 @@
       </w:pPr>
     </w:lvl>
   </w:abstractNum>
+  <w:abstractNum w:abstractNumId="5" w15:restartNumberingAfterBreak="0">
+    <w:nsid w:val="6AFD467A"/>
+    <w:multiLevelType w:val="hybridMultilevel"/>
+    <w:tmpl w:val="978EA28C"/>
+    <w:lvl w:ilvl="0" w:tplc="4D40E7DC">
+      <w:start w:val="1"/>
+      <w:numFmt w:val="upperLetter"/>
+      <w:lvlText w:val="%1."/>
+      <w:lvlJc w:val="left"/>
+      <w:pPr>
+        <w:ind w:left="720" w:hanging="360"/>
+      </w:pPr>
+      <w:rPr>
+        <w:rFonts w:hint="default"/>
+        <w:b/>
+        <w:bCs/>
+      </w:rPr>
+    </w:lvl>
+    <w:lvl w:ilvl="1" w:tplc="40090019" w:tentative="1">
+      <w:start w:val="1"/>
+      <w:numFmt w:val="lowerLetter"/>
+      <w:lvlText w:val="%2."/>
+      <w:lvlJc w:val="left"/>
+      <w:pPr>
+        <w:ind w:left="1440" w:hanging="360"/>
+      </w:pPr>
+    </w:lvl>
+    <w:lvl w:ilvl="2" w:tplc="4009001B" w:tentative="1">
+      <w:start w:val="1"/>
+      <w:numFmt w:val="lowerRoman"/>
+      <w:lvlText w:val="%3."/>
+      <w:lvlJc w:val="right"/>
+      <w:pPr>
+        <w:ind w:left="2160" w:hanging="180"/>
+      </w:pPr>
+    </w:lvl>
+    <w:lvl w:ilvl="3" w:tplc="4009000F" w:tentative="1">
+      <w:start w:val="1"/>
+      <w:numFmt w:val="decimal"/>
+      <w:lvlText w:val="%4."/>
+      <w:lvlJc w:val="left"/>
+      <w:pPr>
+        <w:ind w:left="2880" w:hanging="360"/>
+      </w:pPr>
+    </w:lvl>
+    <w:lvl w:ilvl="4" w:tplc="40090019" w:tentative="1">
+      <w:start w:val="1"/>
+      <w:numFmt w:val="lowerLetter"/>
+      <w:lvlText w:val="%5."/>
+      <w:lvlJc w:val="left"/>
+      <w:pPr>
+        <w:ind w:left="3600" w:hanging="360"/>
+      </w:pPr>
+    </w:lvl>
+    <w:lvl w:ilvl="5" w:tplc="4009001B" w:tentative="1">
+      <w:start w:val="1"/>
+      <w:numFmt w:val="lowerRoman"/>
+      <w:lvlText w:val="%6."/>
+      <w:lvlJc w:val="right"/>
+      <w:pPr>
+        <w:ind w:left="4320" w:hanging="180"/>
+      </w:pPr>
+    </w:lvl>
+    <w:lvl w:ilvl="6" w:tplc="4009000F" w:tentative="1">
+      <w:start w:val="1"/>
+      <w:numFmt w:val="decimal"/>
+      <w:lvlText w:val="%7."/>
+      <w:lvlJc w:val="left"/>
+      <w:pPr>
+        <w:ind w:left="5040" w:hanging="360"/>
+      </w:pPr>
+    </w:lvl>
+    <w:lvl w:ilvl="7" w:tplc="40090019" w:tentative="1">
+      <w:start w:val="1"/>
+      <w:numFmt w:val="lowerLetter"/>
+      <w:lvlText w:val="%8."/>
+      <w:lvlJc w:val="left"/>
+      <w:pPr>
+        <w:ind w:left="5760" w:hanging="360"/>
+      </w:pPr>
+    </w:lvl>
+    <w:lvl w:ilvl="8" w:tplc="4009001B" w:tentative="1">
+      <w:start w:val="1"/>
+      <w:numFmt w:val="lowerRoman"/>
+      <w:lvlText w:val="%9."/>
+      <w:lvlJc w:val="right"/>
+      <w:pPr>
+        <w:ind w:left="6480" w:hanging="180"/>
+      </w:pPr>
+    </w:lvl>
+  </w:abstractNum>
   <w:num w:numId="1" w16cid:durableId="1909535103">
     <w:abstractNumId w:val="0"/>
   </w:num>
   <w:num w:numId="2" w16cid:durableId="282226345">
+    <w:abstractNumId w:val="4"/>
+  </w:num>
+  <w:num w:numId="3" w16cid:durableId="2110391504">
     <w:abstractNumId w:val="3"/>
   </w:num>
-  <w:num w:numId="3" w16cid:durableId="2110391504">
+  <w:num w:numId="4" w16cid:durableId="185825690">
     <w:abstractNumId w:val="2"/>
   </w:num>
-  <w:num w:numId="4" w16cid:durableId="185825690">
+  <w:num w:numId="5" w16cid:durableId="1862278478">
+    <w:abstractNumId w:val="5"/>
+  </w:num>
+  <w:num w:numId="6" w16cid:durableId="1522016474">
     <w:abstractNumId w:val="1"/>
   </w:num>
 </w:numbering>
@@ -2579,6 +5886,15 @@
       <w:shd w:val="clear" w:color="auto" w:fill="E1DFDD"/>
     </w:rPr>
   </w:style>
+  <w:style w:type="paragraph" w:styleId="NoSpacing">
+    <w:name w:val="No Spacing"/>
+    <w:uiPriority w:val="1"/>
+    <w:qFormat/>
+    <w:rsid w:val="00EB1F2B"/>
+    <w:pPr>
+      <w:spacing w:after="0" w:line="240" w:lineRule="auto"/>
+    </w:pPr>
+  </w:style>
 </w:styles>
 </file>
 

</xml_diff>